<commit_message>
Add the 5-question Chapter 17 quick check and make the Word worksheets English-only
New part ch17-qc (5 questions, 5 marks) sits before ch17-test on the home page and in the chapter page: Q1/Q2 instant-feedback MC, Q3/Q4 pick-the-method plus type the count then press Submit, Q5 tick every red/blue combination in a table then Submit. New question.quick data (mode/input/multi/head/rows) with matching app.js rendering, grading and CSS, plus build.py validation. make_worksheet_docx.py now prints English only (no zh field is read at all), prints the answer sheet at the top like a DSE paper, and understands quick input boxes and tick tables; both ch17-test and ch17-qc worksheets regenerated.
</commit_message>
<xml_diff>
--- a/docs/worksheets/ch17-test-worksheet.docx
+++ b/docs/worksheets/ch17-test-worksheet.docx
@@ -16,7 +16,7 @@
           <w:color w:val="1F2937"/>
           <w:sz w:val="32"/>
         </w:rPr>
-        <w:t>17 測前溫習 · 精選題 ／ Chapter 17 Pre-test Revision · Selected Questions</w:t>
+        <w:t>Chapter 17 Pre-test Revision · Selected Questions</w:t>
       </w:r>
     </w:p>
     <w:p>
@@ -33,7 +33,7 @@
           <w:color w:val="6B7280"/>
           <w:sz w:val="20"/>
         </w:rPr>
-        <w:t>S.5 Mathematics · Chapter 17 Pre-test Revision · 滿分 30 分 Total 30 marks</w:t>
+        <w:t>S.5 Mathematics · Chapter 17 Pre-test Revision · Total 30 marks</w:t>
       </w:r>
     </w:p>
     <w:tbl>
@@ -67,7 +67,7 @@
                 <w:color w:val="1F2937"/>
                 <w:sz w:val="20"/>
               </w:rPr>
-              <w:t>姓名 Name：____________　班別 Class：________　日期 Date：________　得分 Score：______ ／ 30</w:t>
+              <w:t>Name: ____________ Class: ________ Date: ________ Score: ______ / 30</w:t>
             </w:r>
           </w:p>
         </w:tc>
@@ -76,7 +76,7 @@
     <w:p>
       <w:pPr>
         <w:keepNext w:val="0"/>
-        <w:spacing w:after="0" w:before="120" w:line="300" w:lineRule="auto"/>
+        <w:spacing w:after="200" w:before="120" w:line="300" w:lineRule="auto"/>
       </w:pPr>
       <w:r>
         <w:rPr>
@@ -86,24 +86,768 @@
           <w:color w:val="6B7280"/>
           <w:sz w:val="19"/>
         </w:rPr>
-        <w:t>全卷 10 題、30 分：甲部 4 題多項選擇（每題 2 分，共 8 分），乙部 6 題長題目（共 22 分）。</w:t>
+        <w:t>10 questions, 30 marks in all: Section A has 4 multiple-choice questions (2 marks each, 8 marks) and Section B has 6 conventional questions (22 marks).</w:t>
       </w:r>
     </w:p>
     <w:p>
       <w:pPr>
-        <w:keepNext w:val="0"/>
-        <w:spacing w:after="200" w:before="0" w:line="300" w:lineRule="auto"/>
+        <w:keepNext/>
+        <w:spacing w:after="60" w:before="120" w:line="300" w:lineRule="auto"/>
       </w:pPr>
       <w:r>
         <w:rPr>
           <w:rFonts w:ascii="Segoe UI" w:hAnsi="Segoe UI" w:eastAsia="Microsoft JhengHei"/>
-          <w:b w:val="0"/>
+          <w:b/>
           <w:i w:val="0"/>
-          <w:color w:val="6B7280"/>
-          <w:sz w:val="18"/>
+          <w:color w:val="1F2937"/>
+          <w:sz w:val="21"/>
         </w:rPr>
-        <w:t xml:space="preserve">10 questions, 30 marks in all: Section A has 4 multiple-choice questions (2 marks each, 8 marks) and Section B has 6 conventional questions (22 marks). </w:t>
+        <w:t>Answer sheet</w:t>
       </w:r>
+    </w:p>
+    <w:tbl>
+      <w:tblPr>
+        <w:tblW w:type="auto" w:w="0"/>
+        <w:tblLook w:firstColumn="1" w:firstRow="1" w:lastColumn="0" w:lastRow="0" w:noHBand="0" w:noVBand="1" w:val="04A0"/>
+      </w:tblPr>
+      <w:tblGrid>
+        <w:gridCol w:w="1928"/>
+        <w:gridCol w:w="1928"/>
+        <w:gridCol w:w="1928"/>
+        <w:gridCol w:w="1928"/>
+        <w:gridCol w:w="1928"/>
+      </w:tblGrid>
+      <w:tr>
+        <w:trPr>
+          <w:cantSplit/>
+        </w:trPr>
+        <w:tc>
+          <w:tcPr>
+            <w:tcW w:type="dxa" w:w="2409"/>
+            <w:tcBorders>
+              <w:top w:val="single" w:sz="4" w:color="BFBFBF"/>
+              <w:left w:val="single" w:sz="4" w:color="BFBFBF"/>
+              <w:bottom w:val="single" w:sz="4" w:color="BFBFBF"/>
+              <w:right w:val="single" w:sz="4" w:color="BFBFBF"/>
+            </w:tcBorders>
+          </w:tcPr>
+          <w:p>
+            <w:pPr>
+              <w:keepNext/>
+              <w:spacing w:after="0"/>
+              <w:jc w:val="center"/>
+            </w:pPr>
+            <w:r>
+              <w:rPr>
+                <w:rFonts w:ascii="Segoe UI" w:hAnsi="Segoe UI" w:eastAsia="Microsoft JhengHei"/>
+                <w:b/>
+                <w:i w:val="0"/>
+                <w:color w:val="6B7280"/>
+                <w:sz w:val="20"/>
+              </w:rPr>
+              <w:t>Q.</w:t>
+            </w:r>
+          </w:p>
+        </w:tc>
+        <w:tc>
+          <w:tcPr>
+            <w:tcW w:type="dxa" w:w="2409"/>
+            <w:tcBorders>
+              <w:top w:val="single" w:sz="4" w:color="BFBFBF"/>
+              <w:left w:val="single" w:sz="4" w:color="BFBFBF"/>
+              <w:bottom w:val="single" w:sz="4" w:color="BFBFBF"/>
+              <w:right w:val="single" w:sz="4" w:color="BFBFBF"/>
+            </w:tcBorders>
+          </w:tcPr>
+          <w:p>
+            <w:pPr>
+              <w:keepNext/>
+              <w:spacing w:after="0"/>
+              <w:jc w:val="center"/>
+            </w:pPr>
+            <w:r>
+              <w:rPr>
+                <w:rFonts w:ascii="Segoe UI" w:hAnsi="Segoe UI" w:eastAsia="Microsoft JhengHei"/>
+                <w:b/>
+                <w:i w:val="0"/>
+                <w:color w:val="6B7280"/>
+                <w:sz w:val="20"/>
+              </w:rPr>
+              <w:t>A</w:t>
+            </w:r>
+          </w:p>
+        </w:tc>
+        <w:tc>
+          <w:tcPr>
+            <w:tcW w:type="dxa" w:w="2409"/>
+            <w:tcBorders>
+              <w:top w:val="single" w:sz="4" w:color="BFBFBF"/>
+              <w:left w:val="single" w:sz="4" w:color="BFBFBF"/>
+              <w:bottom w:val="single" w:sz="4" w:color="BFBFBF"/>
+              <w:right w:val="single" w:sz="4" w:color="BFBFBF"/>
+            </w:tcBorders>
+          </w:tcPr>
+          <w:p>
+            <w:pPr>
+              <w:keepNext/>
+              <w:spacing w:after="0"/>
+              <w:jc w:val="center"/>
+            </w:pPr>
+            <w:r>
+              <w:rPr>
+                <w:rFonts w:ascii="Segoe UI" w:hAnsi="Segoe UI" w:eastAsia="Microsoft JhengHei"/>
+                <w:b/>
+                <w:i w:val="0"/>
+                <w:color w:val="6B7280"/>
+                <w:sz w:val="20"/>
+              </w:rPr>
+              <w:t>B</w:t>
+            </w:r>
+          </w:p>
+        </w:tc>
+        <w:tc>
+          <w:tcPr>
+            <w:tcW w:type="dxa" w:w="2409"/>
+            <w:tcBorders>
+              <w:top w:val="single" w:sz="4" w:color="BFBFBF"/>
+              <w:left w:val="single" w:sz="4" w:color="BFBFBF"/>
+              <w:bottom w:val="single" w:sz="4" w:color="BFBFBF"/>
+              <w:right w:val="single" w:sz="4" w:color="BFBFBF"/>
+            </w:tcBorders>
+          </w:tcPr>
+          <w:p>
+            <w:pPr>
+              <w:keepNext/>
+              <w:spacing w:after="0"/>
+              <w:jc w:val="center"/>
+            </w:pPr>
+            <w:r>
+              <w:rPr>
+                <w:rFonts w:ascii="Segoe UI" w:hAnsi="Segoe UI" w:eastAsia="Microsoft JhengHei"/>
+                <w:b/>
+                <w:i w:val="0"/>
+                <w:color w:val="6B7280"/>
+                <w:sz w:val="20"/>
+              </w:rPr>
+              <w:t>C</w:t>
+            </w:r>
+          </w:p>
+        </w:tc>
+        <w:tc>
+          <w:tcPr>
+            <w:tcW w:type="dxa" w:w="2409"/>
+            <w:tcBorders>
+              <w:top w:val="single" w:sz="4" w:color="BFBFBF"/>
+              <w:left w:val="single" w:sz="4" w:color="BFBFBF"/>
+              <w:bottom w:val="single" w:sz="4" w:color="BFBFBF"/>
+              <w:right w:val="single" w:sz="4" w:color="BFBFBF"/>
+            </w:tcBorders>
+          </w:tcPr>
+          <w:p>
+            <w:pPr>
+              <w:keepNext/>
+              <w:spacing w:after="0"/>
+              <w:jc w:val="center"/>
+            </w:pPr>
+            <w:r>
+              <w:rPr>
+                <w:rFonts w:ascii="Segoe UI" w:hAnsi="Segoe UI" w:eastAsia="Microsoft JhengHei"/>
+                <w:b/>
+                <w:i w:val="0"/>
+                <w:color w:val="6B7280"/>
+                <w:sz w:val="20"/>
+              </w:rPr>
+              <w:t>D</w:t>
+            </w:r>
+          </w:p>
+        </w:tc>
+      </w:tr>
+      <w:tr>
+        <w:trPr>
+          <w:cantSplit/>
+        </w:trPr>
+        <w:tc>
+          <w:tcPr>
+            <w:tcW w:type="dxa" w:w="1928"/>
+            <w:tcBorders>
+              <w:top w:val="single" w:sz="4" w:color="BFBFBF"/>
+              <w:left w:val="single" w:sz="4" w:color="BFBFBF"/>
+              <w:bottom w:val="single" w:sz="4" w:color="BFBFBF"/>
+              <w:right w:val="single" w:sz="4" w:color="BFBFBF"/>
+            </w:tcBorders>
+          </w:tcPr>
+          <w:p>
+            <w:pPr>
+              <w:keepNext/>
+              <w:spacing w:after="0"/>
+              <w:jc w:val="center"/>
+            </w:pPr>
+            <w:r>
+              <w:rPr>
+                <w:rFonts w:ascii="Segoe UI" w:hAnsi="Segoe UI" w:eastAsia="Microsoft JhengHei"/>
+                <w:b/>
+                <w:i w:val="0"/>
+                <w:color w:val="1F2937"/>
+                <w:sz w:val="20"/>
+              </w:rPr>
+              <w:t>A1</w:t>
+            </w:r>
+          </w:p>
+        </w:tc>
+        <w:tc>
+          <w:tcPr>
+            <w:tcW w:type="dxa" w:w="2409"/>
+            <w:tcBorders>
+              <w:top w:val="single" w:sz="4" w:color="BFBFBF"/>
+              <w:left w:val="single" w:sz="4" w:color="BFBFBF"/>
+              <w:bottom w:val="single" w:sz="4" w:color="BFBFBF"/>
+              <w:right w:val="single" w:sz="4" w:color="BFBFBF"/>
+            </w:tcBorders>
+          </w:tcPr>
+          <w:p>
+            <w:pPr>
+              <w:keepNext/>
+              <w:spacing w:after="0"/>
+              <w:jc w:val="center"/>
+            </w:pPr>
+            <w:r>
+              <w:rPr>
+                <w:rFonts w:ascii="Segoe UI" w:hAnsi="Segoe UI" w:eastAsia="Microsoft JhengHei"/>
+                <w:b w:val="0"/>
+                <w:i w:val="0"/>
+                <w:color w:val="6B7280"/>
+                <w:sz w:val="22"/>
+              </w:rPr>
+              <w:t>○</w:t>
+            </w:r>
+          </w:p>
+        </w:tc>
+        <w:tc>
+          <w:tcPr>
+            <w:tcW w:type="dxa" w:w="2409"/>
+            <w:tcBorders>
+              <w:top w:val="single" w:sz="4" w:color="BFBFBF"/>
+              <w:left w:val="single" w:sz="4" w:color="BFBFBF"/>
+              <w:bottom w:val="single" w:sz="4" w:color="BFBFBF"/>
+              <w:right w:val="single" w:sz="4" w:color="BFBFBF"/>
+            </w:tcBorders>
+          </w:tcPr>
+          <w:p>
+            <w:pPr>
+              <w:keepNext/>
+              <w:spacing w:after="0"/>
+              <w:jc w:val="center"/>
+            </w:pPr>
+            <w:r>
+              <w:rPr>
+                <w:rFonts w:ascii="Segoe UI" w:hAnsi="Segoe UI" w:eastAsia="Microsoft JhengHei"/>
+                <w:b w:val="0"/>
+                <w:i w:val="0"/>
+                <w:color w:val="6B7280"/>
+                <w:sz w:val="22"/>
+              </w:rPr>
+              <w:t>○</w:t>
+            </w:r>
+          </w:p>
+        </w:tc>
+        <w:tc>
+          <w:tcPr>
+            <w:tcW w:type="dxa" w:w="2409"/>
+            <w:tcBorders>
+              <w:top w:val="single" w:sz="4" w:color="BFBFBF"/>
+              <w:left w:val="single" w:sz="4" w:color="BFBFBF"/>
+              <w:bottom w:val="single" w:sz="4" w:color="BFBFBF"/>
+              <w:right w:val="single" w:sz="4" w:color="BFBFBF"/>
+            </w:tcBorders>
+          </w:tcPr>
+          <w:p>
+            <w:pPr>
+              <w:keepNext/>
+              <w:spacing w:after="0"/>
+              <w:jc w:val="center"/>
+            </w:pPr>
+            <w:r>
+              <w:rPr>
+                <w:rFonts w:ascii="Segoe UI" w:hAnsi="Segoe UI" w:eastAsia="Microsoft JhengHei"/>
+                <w:b w:val="0"/>
+                <w:i w:val="0"/>
+                <w:color w:val="6B7280"/>
+                <w:sz w:val="22"/>
+              </w:rPr>
+              <w:t>○</w:t>
+            </w:r>
+          </w:p>
+        </w:tc>
+        <w:tc>
+          <w:tcPr>
+            <w:tcW w:type="dxa" w:w="2409"/>
+            <w:tcBorders>
+              <w:top w:val="single" w:sz="4" w:color="BFBFBF"/>
+              <w:left w:val="single" w:sz="4" w:color="BFBFBF"/>
+              <w:bottom w:val="single" w:sz="4" w:color="BFBFBF"/>
+              <w:right w:val="single" w:sz="4" w:color="BFBFBF"/>
+            </w:tcBorders>
+          </w:tcPr>
+          <w:p>
+            <w:pPr>
+              <w:keepNext/>
+              <w:spacing w:after="0"/>
+              <w:jc w:val="center"/>
+            </w:pPr>
+            <w:r>
+              <w:rPr>
+                <w:rFonts w:ascii="Segoe UI" w:hAnsi="Segoe UI" w:eastAsia="Microsoft JhengHei"/>
+                <w:b w:val="0"/>
+                <w:i w:val="0"/>
+                <w:color w:val="6B7280"/>
+                <w:sz w:val="22"/>
+              </w:rPr>
+              <w:t>○</w:t>
+            </w:r>
+          </w:p>
+        </w:tc>
+      </w:tr>
+      <w:tr>
+        <w:trPr>
+          <w:cantSplit/>
+        </w:trPr>
+        <w:tc>
+          <w:tcPr>
+            <w:tcW w:type="dxa" w:w="1928"/>
+            <w:tcBorders>
+              <w:top w:val="single" w:sz="4" w:color="BFBFBF"/>
+              <w:left w:val="single" w:sz="4" w:color="BFBFBF"/>
+              <w:bottom w:val="single" w:sz="4" w:color="BFBFBF"/>
+              <w:right w:val="single" w:sz="4" w:color="BFBFBF"/>
+            </w:tcBorders>
+          </w:tcPr>
+          <w:p>
+            <w:pPr>
+              <w:keepNext/>
+              <w:spacing w:after="0"/>
+              <w:jc w:val="center"/>
+            </w:pPr>
+            <w:r>
+              <w:rPr>
+                <w:rFonts w:ascii="Segoe UI" w:hAnsi="Segoe UI" w:eastAsia="Microsoft JhengHei"/>
+                <w:b/>
+                <w:i w:val="0"/>
+                <w:color w:val="1F2937"/>
+                <w:sz w:val="20"/>
+              </w:rPr>
+              <w:t>A2</w:t>
+            </w:r>
+          </w:p>
+        </w:tc>
+        <w:tc>
+          <w:tcPr>
+            <w:tcW w:type="dxa" w:w="2409"/>
+            <w:tcBorders>
+              <w:top w:val="single" w:sz="4" w:color="BFBFBF"/>
+              <w:left w:val="single" w:sz="4" w:color="BFBFBF"/>
+              <w:bottom w:val="single" w:sz="4" w:color="BFBFBF"/>
+              <w:right w:val="single" w:sz="4" w:color="BFBFBF"/>
+            </w:tcBorders>
+          </w:tcPr>
+          <w:p>
+            <w:pPr>
+              <w:keepNext/>
+              <w:spacing w:after="0"/>
+              <w:jc w:val="center"/>
+            </w:pPr>
+            <w:r>
+              <w:rPr>
+                <w:rFonts w:ascii="Segoe UI" w:hAnsi="Segoe UI" w:eastAsia="Microsoft JhengHei"/>
+                <w:b w:val="0"/>
+                <w:i w:val="0"/>
+                <w:color w:val="6B7280"/>
+                <w:sz w:val="22"/>
+              </w:rPr>
+              <w:t>○</w:t>
+            </w:r>
+          </w:p>
+        </w:tc>
+        <w:tc>
+          <w:tcPr>
+            <w:tcW w:type="dxa" w:w="2409"/>
+            <w:tcBorders>
+              <w:top w:val="single" w:sz="4" w:color="BFBFBF"/>
+              <w:left w:val="single" w:sz="4" w:color="BFBFBF"/>
+              <w:bottom w:val="single" w:sz="4" w:color="BFBFBF"/>
+              <w:right w:val="single" w:sz="4" w:color="BFBFBF"/>
+            </w:tcBorders>
+          </w:tcPr>
+          <w:p>
+            <w:pPr>
+              <w:keepNext/>
+              <w:spacing w:after="0"/>
+              <w:jc w:val="center"/>
+            </w:pPr>
+            <w:r>
+              <w:rPr>
+                <w:rFonts w:ascii="Segoe UI" w:hAnsi="Segoe UI" w:eastAsia="Microsoft JhengHei"/>
+                <w:b w:val="0"/>
+                <w:i w:val="0"/>
+                <w:color w:val="6B7280"/>
+                <w:sz w:val="22"/>
+              </w:rPr>
+              <w:t>○</w:t>
+            </w:r>
+          </w:p>
+        </w:tc>
+        <w:tc>
+          <w:tcPr>
+            <w:tcW w:type="dxa" w:w="2409"/>
+            <w:tcBorders>
+              <w:top w:val="single" w:sz="4" w:color="BFBFBF"/>
+              <w:left w:val="single" w:sz="4" w:color="BFBFBF"/>
+              <w:bottom w:val="single" w:sz="4" w:color="BFBFBF"/>
+              <w:right w:val="single" w:sz="4" w:color="BFBFBF"/>
+            </w:tcBorders>
+          </w:tcPr>
+          <w:p>
+            <w:pPr>
+              <w:keepNext/>
+              <w:spacing w:after="0"/>
+              <w:jc w:val="center"/>
+            </w:pPr>
+            <w:r>
+              <w:rPr>
+                <w:rFonts w:ascii="Segoe UI" w:hAnsi="Segoe UI" w:eastAsia="Microsoft JhengHei"/>
+                <w:b w:val="0"/>
+                <w:i w:val="0"/>
+                <w:color w:val="6B7280"/>
+                <w:sz w:val="22"/>
+              </w:rPr>
+              <w:t>○</w:t>
+            </w:r>
+          </w:p>
+        </w:tc>
+        <w:tc>
+          <w:tcPr>
+            <w:tcW w:type="dxa" w:w="2409"/>
+            <w:tcBorders>
+              <w:top w:val="single" w:sz="4" w:color="BFBFBF"/>
+              <w:left w:val="single" w:sz="4" w:color="BFBFBF"/>
+              <w:bottom w:val="single" w:sz="4" w:color="BFBFBF"/>
+              <w:right w:val="single" w:sz="4" w:color="BFBFBF"/>
+            </w:tcBorders>
+          </w:tcPr>
+          <w:p>
+            <w:pPr>
+              <w:keepNext/>
+              <w:spacing w:after="0"/>
+              <w:jc w:val="center"/>
+            </w:pPr>
+            <w:r>
+              <w:rPr>
+                <w:rFonts w:ascii="Segoe UI" w:hAnsi="Segoe UI" w:eastAsia="Microsoft JhengHei"/>
+                <w:b w:val="0"/>
+                <w:i w:val="0"/>
+                <w:color w:val="6B7280"/>
+                <w:sz w:val="22"/>
+              </w:rPr>
+              <w:t>○</w:t>
+            </w:r>
+          </w:p>
+        </w:tc>
+      </w:tr>
+      <w:tr>
+        <w:trPr>
+          <w:cantSplit/>
+        </w:trPr>
+        <w:tc>
+          <w:tcPr>
+            <w:tcW w:type="dxa" w:w="1928"/>
+            <w:tcBorders>
+              <w:top w:val="single" w:sz="4" w:color="BFBFBF"/>
+              <w:left w:val="single" w:sz="4" w:color="BFBFBF"/>
+              <w:bottom w:val="single" w:sz="4" w:color="BFBFBF"/>
+              <w:right w:val="single" w:sz="4" w:color="BFBFBF"/>
+            </w:tcBorders>
+          </w:tcPr>
+          <w:p>
+            <w:pPr>
+              <w:keepNext/>
+              <w:spacing w:after="0"/>
+              <w:jc w:val="center"/>
+            </w:pPr>
+            <w:r>
+              <w:rPr>
+                <w:rFonts w:ascii="Segoe UI" w:hAnsi="Segoe UI" w:eastAsia="Microsoft JhengHei"/>
+                <w:b/>
+                <w:i w:val="0"/>
+                <w:color w:val="1F2937"/>
+                <w:sz w:val="20"/>
+              </w:rPr>
+              <w:t>A3</w:t>
+            </w:r>
+          </w:p>
+        </w:tc>
+        <w:tc>
+          <w:tcPr>
+            <w:tcW w:type="dxa" w:w="2409"/>
+            <w:tcBorders>
+              <w:top w:val="single" w:sz="4" w:color="BFBFBF"/>
+              <w:left w:val="single" w:sz="4" w:color="BFBFBF"/>
+              <w:bottom w:val="single" w:sz="4" w:color="BFBFBF"/>
+              <w:right w:val="single" w:sz="4" w:color="BFBFBF"/>
+            </w:tcBorders>
+          </w:tcPr>
+          <w:p>
+            <w:pPr>
+              <w:keepNext/>
+              <w:spacing w:after="0"/>
+              <w:jc w:val="center"/>
+            </w:pPr>
+            <w:r>
+              <w:rPr>
+                <w:rFonts w:ascii="Segoe UI" w:hAnsi="Segoe UI" w:eastAsia="Microsoft JhengHei"/>
+                <w:b w:val="0"/>
+                <w:i w:val="0"/>
+                <w:color w:val="6B7280"/>
+                <w:sz w:val="22"/>
+              </w:rPr>
+              <w:t>○</w:t>
+            </w:r>
+          </w:p>
+        </w:tc>
+        <w:tc>
+          <w:tcPr>
+            <w:tcW w:type="dxa" w:w="2409"/>
+            <w:tcBorders>
+              <w:top w:val="single" w:sz="4" w:color="BFBFBF"/>
+              <w:left w:val="single" w:sz="4" w:color="BFBFBF"/>
+              <w:bottom w:val="single" w:sz="4" w:color="BFBFBF"/>
+              <w:right w:val="single" w:sz="4" w:color="BFBFBF"/>
+            </w:tcBorders>
+          </w:tcPr>
+          <w:p>
+            <w:pPr>
+              <w:keepNext/>
+              <w:spacing w:after="0"/>
+              <w:jc w:val="center"/>
+            </w:pPr>
+            <w:r>
+              <w:rPr>
+                <w:rFonts w:ascii="Segoe UI" w:hAnsi="Segoe UI" w:eastAsia="Microsoft JhengHei"/>
+                <w:b w:val="0"/>
+                <w:i w:val="0"/>
+                <w:color w:val="6B7280"/>
+                <w:sz w:val="22"/>
+              </w:rPr>
+              <w:t>○</w:t>
+            </w:r>
+          </w:p>
+        </w:tc>
+        <w:tc>
+          <w:tcPr>
+            <w:tcW w:type="dxa" w:w="2409"/>
+            <w:tcBorders>
+              <w:top w:val="single" w:sz="4" w:color="BFBFBF"/>
+              <w:left w:val="single" w:sz="4" w:color="BFBFBF"/>
+              <w:bottom w:val="single" w:sz="4" w:color="BFBFBF"/>
+              <w:right w:val="single" w:sz="4" w:color="BFBFBF"/>
+            </w:tcBorders>
+          </w:tcPr>
+          <w:p>
+            <w:pPr>
+              <w:keepNext/>
+              <w:spacing w:after="0"/>
+              <w:jc w:val="center"/>
+            </w:pPr>
+            <w:r>
+              <w:rPr>
+                <w:rFonts w:ascii="Segoe UI" w:hAnsi="Segoe UI" w:eastAsia="Microsoft JhengHei"/>
+                <w:b w:val="0"/>
+                <w:i w:val="0"/>
+                <w:color w:val="6B7280"/>
+                <w:sz w:val="22"/>
+              </w:rPr>
+              <w:t>○</w:t>
+            </w:r>
+          </w:p>
+        </w:tc>
+        <w:tc>
+          <w:tcPr>
+            <w:tcW w:type="dxa" w:w="2409"/>
+            <w:tcBorders>
+              <w:top w:val="single" w:sz="4" w:color="BFBFBF"/>
+              <w:left w:val="single" w:sz="4" w:color="BFBFBF"/>
+              <w:bottom w:val="single" w:sz="4" w:color="BFBFBF"/>
+              <w:right w:val="single" w:sz="4" w:color="BFBFBF"/>
+            </w:tcBorders>
+          </w:tcPr>
+          <w:p>
+            <w:pPr>
+              <w:keepNext/>
+              <w:spacing w:after="0"/>
+              <w:jc w:val="center"/>
+            </w:pPr>
+            <w:r>
+              <w:rPr>
+                <w:rFonts w:ascii="Segoe UI" w:hAnsi="Segoe UI" w:eastAsia="Microsoft JhengHei"/>
+                <w:b w:val="0"/>
+                <w:i w:val="0"/>
+                <w:color w:val="6B7280"/>
+                <w:sz w:val="22"/>
+              </w:rPr>
+              <w:t>○</w:t>
+            </w:r>
+          </w:p>
+        </w:tc>
+      </w:tr>
+      <w:tr>
+        <w:trPr>
+          <w:cantSplit/>
+        </w:trPr>
+        <w:tc>
+          <w:tcPr>
+            <w:tcW w:type="dxa" w:w="1928"/>
+            <w:tcBorders>
+              <w:top w:val="single" w:sz="4" w:color="BFBFBF"/>
+              <w:left w:val="single" w:sz="4" w:color="BFBFBF"/>
+              <w:bottom w:val="single" w:sz="4" w:color="BFBFBF"/>
+              <w:right w:val="single" w:sz="4" w:color="BFBFBF"/>
+            </w:tcBorders>
+          </w:tcPr>
+          <w:p>
+            <w:pPr>
+              <w:keepNext w:val="0"/>
+              <w:spacing w:after="0"/>
+              <w:jc w:val="center"/>
+            </w:pPr>
+            <w:r>
+              <w:rPr>
+                <w:rFonts w:ascii="Segoe UI" w:hAnsi="Segoe UI" w:eastAsia="Microsoft JhengHei"/>
+                <w:b/>
+                <w:i w:val="0"/>
+                <w:color w:val="1F2937"/>
+                <w:sz w:val="20"/>
+              </w:rPr>
+              <w:t>A4</w:t>
+            </w:r>
+          </w:p>
+        </w:tc>
+        <w:tc>
+          <w:tcPr>
+            <w:tcW w:type="dxa" w:w="2409"/>
+            <w:tcBorders>
+              <w:top w:val="single" w:sz="4" w:color="BFBFBF"/>
+              <w:left w:val="single" w:sz="4" w:color="BFBFBF"/>
+              <w:bottom w:val="single" w:sz="4" w:color="BFBFBF"/>
+              <w:right w:val="single" w:sz="4" w:color="BFBFBF"/>
+            </w:tcBorders>
+          </w:tcPr>
+          <w:p>
+            <w:pPr>
+              <w:keepNext w:val="0"/>
+              <w:spacing w:after="0"/>
+              <w:jc w:val="center"/>
+            </w:pPr>
+            <w:r>
+              <w:rPr>
+                <w:rFonts w:ascii="Segoe UI" w:hAnsi="Segoe UI" w:eastAsia="Microsoft JhengHei"/>
+                <w:b w:val="0"/>
+                <w:i w:val="0"/>
+                <w:color w:val="6B7280"/>
+                <w:sz w:val="22"/>
+              </w:rPr>
+              <w:t>○</w:t>
+            </w:r>
+          </w:p>
+        </w:tc>
+        <w:tc>
+          <w:tcPr>
+            <w:tcW w:type="dxa" w:w="2409"/>
+            <w:tcBorders>
+              <w:top w:val="single" w:sz="4" w:color="BFBFBF"/>
+              <w:left w:val="single" w:sz="4" w:color="BFBFBF"/>
+              <w:bottom w:val="single" w:sz="4" w:color="BFBFBF"/>
+              <w:right w:val="single" w:sz="4" w:color="BFBFBF"/>
+            </w:tcBorders>
+          </w:tcPr>
+          <w:p>
+            <w:pPr>
+              <w:keepNext w:val="0"/>
+              <w:spacing w:after="0"/>
+              <w:jc w:val="center"/>
+            </w:pPr>
+            <w:r>
+              <w:rPr>
+                <w:rFonts w:ascii="Segoe UI" w:hAnsi="Segoe UI" w:eastAsia="Microsoft JhengHei"/>
+                <w:b w:val="0"/>
+                <w:i w:val="0"/>
+                <w:color w:val="6B7280"/>
+                <w:sz w:val="22"/>
+              </w:rPr>
+              <w:t>○</w:t>
+            </w:r>
+          </w:p>
+        </w:tc>
+        <w:tc>
+          <w:tcPr>
+            <w:tcW w:type="dxa" w:w="2409"/>
+            <w:tcBorders>
+              <w:top w:val="single" w:sz="4" w:color="BFBFBF"/>
+              <w:left w:val="single" w:sz="4" w:color="BFBFBF"/>
+              <w:bottom w:val="single" w:sz="4" w:color="BFBFBF"/>
+              <w:right w:val="single" w:sz="4" w:color="BFBFBF"/>
+            </w:tcBorders>
+          </w:tcPr>
+          <w:p>
+            <w:pPr>
+              <w:keepNext w:val="0"/>
+              <w:spacing w:after="0"/>
+              <w:jc w:val="center"/>
+            </w:pPr>
+            <w:r>
+              <w:rPr>
+                <w:rFonts w:ascii="Segoe UI" w:hAnsi="Segoe UI" w:eastAsia="Microsoft JhengHei"/>
+                <w:b w:val="0"/>
+                <w:i w:val="0"/>
+                <w:color w:val="6B7280"/>
+                <w:sz w:val="22"/>
+              </w:rPr>
+              <w:t>○</w:t>
+            </w:r>
+          </w:p>
+        </w:tc>
+        <w:tc>
+          <w:tcPr>
+            <w:tcW w:type="dxa" w:w="2409"/>
+            <w:tcBorders>
+              <w:top w:val="single" w:sz="4" w:color="BFBFBF"/>
+              <w:left w:val="single" w:sz="4" w:color="BFBFBF"/>
+              <w:bottom w:val="single" w:sz="4" w:color="BFBFBF"/>
+              <w:right w:val="single" w:sz="4" w:color="BFBFBF"/>
+            </w:tcBorders>
+          </w:tcPr>
+          <w:p>
+            <w:pPr>
+              <w:keepNext w:val="0"/>
+              <w:spacing w:after="0"/>
+              <w:jc w:val="center"/>
+            </w:pPr>
+            <w:r>
+              <w:rPr>
+                <w:rFonts w:ascii="Segoe UI" w:hAnsi="Segoe UI" w:eastAsia="Microsoft JhengHei"/>
+                <w:b w:val="0"/>
+                <w:i w:val="0"/>
+                <w:color w:val="6B7280"/>
+                <w:sz w:val="22"/>
+              </w:rPr>
+              <w:t>○</w:t>
+            </w:r>
+          </w:p>
+        </w:tc>
+      </w:tr>
+    </w:tbl>
+    <w:p>
+      <w:pPr>
+        <w:keepNext w:val="0"/>
+        <w:spacing w:after="0" w:before="0" w:line="300" w:lineRule="auto"/>
+      </w:pPr>
     </w:p>
     <w:p>
       <w:pPr>
@@ -118,7 +862,7 @@
           <w:color w:val="1D4ED8"/>
           <w:sz w:val="25"/>
         </w:rPr>
-        <w:t>甲部　Section A · Multiple choice</w:t>
+        <w:t>Section A · Multiple choice (2 marks each, 8 marks in all)</w:t>
       </w:r>
       <w:r>
         <w:rPr>
@@ -128,7 +872,7 @@
           <w:color w:val="6B7280"/>
           <w:sz w:val="20"/>
         </w:rPr>
-        <w:t xml:space="preserve">　（共 8 分 · 8 marks）</w:t>
+        <w:t xml:space="preserve"> (8 marks)</w:t>
       </w:r>
     </w:p>
     <w:p>
@@ -154,13 +898,13 @@
           <w:color w:val="6B7280"/>
           <w:sz w:val="19"/>
         </w:rPr>
-        <w:t>[2 分]</w:t>
+        <w:t>[2 marks]</w:t>
       </w:r>
     </w:p>
     <w:p>
       <w:pPr>
         <w:keepNext/>
-        <w:spacing w:after="20" w:before="0" w:line="300" w:lineRule="auto"/>
+        <w:spacing w:after="40" w:before="0" w:line="300" w:lineRule="auto"/>
         <w:ind w:left="340"/>
       </w:pPr>
       <w:r>
@@ -172,23 +916,6 @@
           <w:sz w:val="21"/>
         </w:rPr>
         <w:t>The first four digits and the last two digits of a six-digit password are formed by a permutation of 1, 2, 3, 4 and a permutation of 8, 9 respectively. How many different six-digit passwords can be formed?</w:t>
-      </w:r>
-    </w:p>
-    <w:p>
-      <w:pPr>
-        <w:keepNext/>
-        <w:spacing w:after="60" w:before="0" w:line="300" w:lineRule="auto"/>
-        <w:ind w:left="340"/>
-      </w:pPr>
-      <w:r>
-        <w:rPr>
-          <w:rFonts w:ascii="Segoe UI" w:hAnsi="Segoe UI" w:eastAsia="Microsoft JhengHei"/>
-          <w:b w:val="0"/>
-          <w:i w:val="0"/>
-          <w:color w:val="6B7280"/>
-          <w:sz w:val="19"/>
-        </w:rPr>
-        <w:t>一個六位數密碼的首四位由 1、2、3、4 排列而成，末兩位由 8、9 排列而成。可以組成多少個不同的六位數密碼？</w:t>
       </w:r>
     </w:p>
     <w:tbl>
@@ -315,6 +1042,12 @@
     </w:tbl>
     <w:p>
       <w:pPr>
+        <w:keepNext w:val="0"/>
+        <w:spacing w:after="0" w:before="0" w:line="300" w:lineRule="auto"/>
+      </w:pPr>
+    </w:p>
+    <w:p>
+      <w:pPr>
         <w:keepNext/>
         <w:spacing w:after="20" w:before="120" w:line="300" w:lineRule="auto"/>
       </w:pPr>
@@ -336,13 +1069,13 @@
           <w:color w:val="6B7280"/>
           <w:sz w:val="19"/>
         </w:rPr>
-        <w:t>[2 分]</w:t>
+        <w:t>[2 marks]</w:t>
       </w:r>
     </w:p>
     <w:p>
       <w:pPr>
         <w:keepNext/>
-        <w:spacing w:after="20" w:before="0" w:line="300" w:lineRule="auto"/>
+        <w:spacing w:after="40" w:before="0" w:line="300" w:lineRule="auto"/>
         <w:ind w:left="340"/>
       </w:pPr>
       <w:r>
@@ -354,23 +1087,6 @@
           <w:sz w:val="21"/>
         </w:rPr>
         <w:t>There are 14 members in a basketball team. If 5 members are selected from the team to form a starting line-up for the next match, consisting of 1 captain and 4 players, how many different starting line-ups can be formed?</w:t>
-      </w:r>
-    </w:p>
-    <w:p>
-      <w:pPr>
-        <w:keepNext/>
-        <w:spacing w:after="60" w:before="0" w:line="300" w:lineRule="auto"/>
-        <w:ind w:left="340"/>
-      </w:pPr>
-      <w:r>
-        <w:rPr>
-          <w:rFonts w:ascii="Segoe UI" w:hAnsi="Segoe UI" w:eastAsia="Microsoft JhengHei"/>
-          <w:b w:val="0"/>
-          <w:i w:val="0"/>
-          <w:color w:val="6B7280"/>
-          <w:sz w:val="19"/>
-        </w:rPr>
-        <w:t>一隊籃球隊有 14 名隊員。若從中選出 5 人做下一場比賽的正選名單，當中包括 1 名隊長及 4 名球員，可以組成多少個不同的正選名單？</w:t>
       </w:r>
     </w:p>
     <w:tbl>
@@ -489,12 +1205,18 @@
                 <w:color w:val="1F2937"/>
                 <w:sz w:val="21"/>
               </w:rPr>
-              <w:t>(D) 10 010</w:t>
+              <w:t>(D) 10 010</w:t>
             </w:r>
           </w:p>
         </w:tc>
       </w:tr>
     </w:tbl>
+    <w:p>
+      <w:pPr>
+        <w:keepNext w:val="0"/>
+        <w:spacing w:after="0" w:before="0" w:line="300" w:lineRule="auto"/>
+      </w:pPr>
+    </w:p>
     <w:p>
       <w:pPr>
         <w:keepNext/>
@@ -518,13 +1240,13 @@
           <w:color w:val="6B7280"/>
           <w:sz w:val="19"/>
         </w:rPr>
-        <w:t>[2 分]</w:t>
+        <w:t>[2 marks]</w:t>
       </w:r>
     </w:p>
     <w:p>
       <w:pPr>
         <w:keepNext/>
-        <w:spacing w:after="20" w:before="0" w:line="300" w:lineRule="auto"/>
+        <w:spacing w:after="40" w:before="0" w:line="300" w:lineRule="auto"/>
         <w:ind w:left="340"/>
       </w:pPr>
       <w:r>
@@ -536,23 +1258,6 @@
           <w:sz w:val="21"/>
         </w:rPr>
         <w:t>In a group, there are 22 S5A students and 18 S5B students. If 5 students of the same class are selected from the group to form a team, how many different teams can be formed?</w:t>
-      </w:r>
-    </w:p>
-    <w:p>
-      <w:pPr>
-        <w:keepNext/>
-        <w:spacing w:after="60" w:before="0" w:line="300" w:lineRule="auto"/>
-        <w:ind w:left="340"/>
-      </w:pPr>
-      <w:r>
-        <w:rPr>
-          <w:rFonts w:ascii="Segoe UI" w:hAnsi="Segoe UI" w:eastAsia="Microsoft JhengHei"/>
-          <w:b w:val="0"/>
-          <w:i w:val="0"/>
-          <w:color w:val="6B7280"/>
-          <w:sz w:val="19"/>
-        </w:rPr>
-        <w:t>一個組合有 22 名中五A 學生與 18 名中五B 學生。若從組合中選出 5 名同班的學生組成一支隊伍，可以組成多少支不同的隊伍？</w:t>
       </w:r>
     </w:p>
     <w:tbl>
@@ -588,7 +1293,7 @@
                 <w:color w:val="1F2937"/>
                 <w:sz w:val="21"/>
               </w:rPr>
-              <w:t>(A) 34 902</w:t>
+              <w:t>(A) 34 902</w:t>
             </w:r>
           </w:p>
         </w:tc>
@@ -615,7 +1320,7 @@
                 <w:color w:val="1F2937"/>
                 <w:sz w:val="21"/>
               </w:rPr>
-              <w:t>(B) 658 008</w:t>
+              <w:t>(B) 658 008</w:t>
             </w:r>
           </w:p>
         </w:tc>
@@ -644,7 +1349,7 @@
                 <w:color w:val="1F2937"/>
                 <w:sz w:val="21"/>
               </w:rPr>
-              <w:t>(C) 4 188 240</w:t>
+              <w:t>(C) 4 188 240</w:t>
             </w:r>
           </w:p>
         </w:tc>
@@ -671,12 +1376,18 @@
                 <w:color w:val="1F2937"/>
                 <w:sz w:val="21"/>
               </w:rPr>
-              <w:t>(D) 225 629 712</w:t>
+              <w:t>(D) 225 629 712</w:t>
             </w:r>
           </w:p>
         </w:tc>
       </w:tr>
     </w:tbl>
+    <w:p>
+      <w:pPr>
+        <w:keepNext w:val="0"/>
+        <w:spacing w:after="0" w:before="0" w:line="300" w:lineRule="auto"/>
+      </w:pPr>
+    </w:p>
     <w:p>
       <w:pPr>
         <w:keepNext/>
@@ -700,13 +1411,13 @@
           <w:color w:val="6B7280"/>
           <w:sz w:val="19"/>
         </w:rPr>
-        <w:t>[2 分]</w:t>
+        <w:t>[2 marks]</w:t>
       </w:r>
     </w:p>
     <w:p>
       <w:pPr>
         <w:keepNext/>
-        <w:spacing w:after="20" w:before="0" w:line="300" w:lineRule="auto"/>
+        <w:spacing w:after="40" w:before="0" w:line="300" w:lineRule="auto"/>
         <w:ind w:left="340"/>
       </w:pPr>
       <w:r>
@@ -718,23 +1429,6 @@
           <w:sz w:val="21"/>
         </w:rPr>
         <w:t>There are 15 S4 students, 18 S5 students and 7 tutors in a tutorial class. If 8 members are selected from the tutorial class to form a study group consisting of at most 3 tutors, how many different study groups can be formed?</w:t>
-      </w:r>
-    </w:p>
-    <w:p>
-      <w:pPr>
-        <w:keepNext/>
-        <w:spacing w:after="60" w:before="0" w:line="300" w:lineRule="auto"/>
-        <w:ind w:left="340"/>
-      </w:pPr>
-      <w:r>
-        <w:rPr>
-          <w:rFonts w:ascii="Segoe UI" w:hAnsi="Segoe UI" w:eastAsia="Microsoft JhengHei"/>
-          <w:b w:val="0"/>
-          <w:i w:val="0"/>
-          <w:color w:val="6B7280"/>
-          <w:sz w:val="19"/>
-        </w:rPr>
-        <w:t>一個補習班有 15 名中四學生、18 名中五學生與 7 名導師。若從中選出 8 人組成溫習小組，當中導師至多 3 名，可以組成多少個不同的溫習小組？</w:t>
       </w:r>
     </w:p>
     <w:tbl>
@@ -770,7 +1464,7 @@
                 <w:color w:val="1F2937"/>
                 <w:sz w:val="21"/>
               </w:rPr>
-              <w:t>(A) 118 305</w:t>
+              <w:t>(A) 118 305</w:t>
             </w:r>
           </w:p>
         </w:tc>
@@ -797,7 +1491,7 @@
                 <w:color w:val="1F2937"/>
                 <w:sz w:val="21"/>
               </w:rPr>
-              <w:t>(B) 8 306 760</w:t>
+              <w:t>(B) 8 306 760</w:t>
             </w:r>
           </w:p>
         </w:tc>
@@ -826,7 +1520,7 @@
                 <w:color w:val="1F2937"/>
                 <w:sz w:val="21"/>
               </w:rPr>
-              <w:t>(C) 67 047 420</w:t>
+              <w:t>(C) 67 047 420</w:t>
             </w:r>
           </w:p>
         </w:tc>
@@ -853,7 +1547,7 @@
                 <w:color w:val="1F2937"/>
                 <w:sz w:val="21"/>
               </w:rPr>
-              <w:t>(D) 75 354 180</w:t>
+              <w:t>(D) 75 354 180</w:t>
             </w:r>
           </w:p>
         </w:tc>
@@ -861,718 +1555,10 @@
     </w:tbl>
     <w:p>
       <w:pPr>
-        <w:keepNext/>
-        <w:spacing w:after="60" w:before="160" w:line="300" w:lineRule="auto"/>
+        <w:keepNext w:val="0"/>
+        <w:spacing w:after="0" w:before="0" w:line="300" w:lineRule="auto"/>
       </w:pPr>
-      <w:r>
-        <w:rPr>
-          <w:rFonts w:ascii="Segoe UI" w:hAnsi="Segoe UI" w:eastAsia="Microsoft JhengHei"/>
-          <w:b/>
-          <w:i w:val="0"/>
-          <w:color w:val="1F2937"/>
-          <w:sz w:val="21"/>
-        </w:rPr>
-        <w:t>作答格 Answer sheet</w:t>
-      </w:r>
     </w:p>
-    <w:tbl>
-      <w:tblPr>
-        <w:tblW w:type="auto" w:w="0"/>
-        <w:tblLook w:firstColumn="1" w:firstRow="1" w:lastColumn="0" w:lastRow="0" w:noHBand="0" w:noVBand="1" w:val="04A0"/>
-      </w:tblPr>
-      <w:tblGrid>
-        <w:gridCol w:w="1928"/>
-        <w:gridCol w:w="1928"/>
-        <w:gridCol w:w="1928"/>
-        <w:gridCol w:w="1928"/>
-        <w:gridCol w:w="1928"/>
-      </w:tblGrid>
-      <w:tr>
-        <w:tc>
-          <w:tcPr>
-            <w:tcW w:type="dxa" w:w="1928"/>
-            <w:tcBorders>
-              <w:top w:val="single" w:sz="4" w:color="BFBFBF"/>
-              <w:left w:val="single" w:sz="4" w:color="BFBFBF"/>
-              <w:bottom w:val="single" w:sz="4" w:color="BFBFBF"/>
-              <w:right w:val="single" w:sz="4" w:color="BFBFBF"/>
-            </w:tcBorders>
-          </w:tcPr>
-          <w:p>
-            <w:pPr>
-              <w:spacing w:after="0"/>
-              <w:jc w:val="center"/>
-            </w:pPr>
-            <w:r>
-              <w:rPr>
-                <w:rFonts w:ascii="Segoe UI" w:hAnsi="Segoe UI" w:eastAsia="Microsoft JhengHei"/>
-                <w:b/>
-                <w:i w:val="0"/>
-                <w:color w:val="6B7280"/>
-                <w:sz w:val="20"/>
-              </w:rPr>
-              <w:t>題號 Q.</w:t>
-            </w:r>
-          </w:p>
-        </w:tc>
-        <w:tc>
-          <w:tcPr>
-            <w:tcW w:type="dxa" w:w="1928"/>
-            <w:tcBorders>
-              <w:top w:val="single" w:sz="4" w:color="BFBFBF"/>
-              <w:left w:val="single" w:sz="4" w:color="BFBFBF"/>
-              <w:bottom w:val="single" w:sz="4" w:color="BFBFBF"/>
-              <w:right w:val="single" w:sz="4" w:color="BFBFBF"/>
-            </w:tcBorders>
-          </w:tcPr>
-          <w:p>
-            <w:pPr>
-              <w:spacing w:after="0"/>
-              <w:jc w:val="center"/>
-            </w:pPr>
-            <w:r>
-              <w:rPr>
-                <w:rFonts w:ascii="Segoe UI" w:hAnsi="Segoe UI" w:eastAsia="Microsoft JhengHei"/>
-                <w:b/>
-                <w:i w:val="0"/>
-                <w:color w:val="6B7280"/>
-                <w:sz w:val="20"/>
-              </w:rPr>
-              <w:t>A</w:t>
-            </w:r>
-          </w:p>
-        </w:tc>
-        <w:tc>
-          <w:tcPr>
-            <w:tcW w:type="dxa" w:w="1928"/>
-            <w:tcBorders>
-              <w:top w:val="single" w:sz="4" w:color="BFBFBF"/>
-              <w:left w:val="single" w:sz="4" w:color="BFBFBF"/>
-              <w:bottom w:val="single" w:sz="4" w:color="BFBFBF"/>
-              <w:right w:val="single" w:sz="4" w:color="BFBFBF"/>
-            </w:tcBorders>
-          </w:tcPr>
-          <w:p>
-            <w:pPr>
-              <w:spacing w:after="0"/>
-              <w:jc w:val="center"/>
-            </w:pPr>
-            <w:r>
-              <w:rPr>
-                <w:rFonts w:ascii="Segoe UI" w:hAnsi="Segoe UI" w:eastAsia="Microsoft JhengHei"/>
-                <w:b/>
-                <w:i w:val="0"/>
-                <w:color w:val="6B7280"/>
-                <w:sz w:val="20"/>
-              </w:rPr>
-              <w:t>B</w:t>
-            </w:r>
-          </w:p>
-        </w:tc>
-        <w:tc>
-          <w:tcPr>
-            <w:tcW w:type="dxa" w:w="1928"/>
-            <w:tcBorders>
-              <w:top w:val="single" w:sz="4" w:color="BFBFBF"/>
-              <w:left w:val="single" w:sz="4" w:color="BFBFBF"/>
-              <w:bottom w:val="single" w:sz="4" w:color="BFBFBF"/>
-              <w:right w:val="single" w:sz="4" w:color="BFBFBF"/>
-            </w:tcBorders>
-          </w:tcPr>
-          <w:p>
-            <w:pPr>
-              <w:spacing w:after="0"/>
-              <w:jc w:val="center"/>
-            </w:pPr>
-            <w:r>
-              <w:rPr>
-                <w:rFonts w:ascii="Segoe UI" w:hAnsi="Segoe UI" w:eastAsia="Microsoft JhengHei"/>
-                <w:b/>
-                <w:i w:val="0"/>
-                <w:color w:val="6B7280"/>
-                <w:sz w:val="20"/>
-              </w:rPr>
-              <w:t>C</w:t>
-            </w:r>
-          </w:p>
-        </w:tc>
-        <w:tc>
-          <w:tcPr>
-            <w:tcW w:type="dxa" w:w="1928"/>
-            <w:tcBorders>
-              <w:top w:val="single" w:sz="4" w:color="BFBFBF"/>
-              <w:left w:val="single" w:sz="4" w:color="BFBFBF"/>
-              <w:bottom w:val="single" w:sz="4" w:color="BFBFBF"/>
-              <w:right w:val="single" w:sz="4" w:color="BFBFBF"/>
-            </w:tcBorders>
-          </w:tcPr>
-          <w:p>
-            <w:pPr>
-              <w:spacing w:after="0"/>
-              <w:jc w:val="center"/>
-            </w:pPr>
-            <w:r>
-              <w:rPr>
-                <w:rFonts w:ascii="Segoe UI" w:hAnsi="Segoe UI" w:eastAsia="Microsoft JhengHei"/>
-                <w:b/>
-                <w:i w:val="0"/>
-                <w:color w:val="6B7280"/>
-                <w:sz w:val="20"/>
-              </w:rPr>
-              <w:t>D</w:t>
-            </w:r>
-          </w:p>
-        </w:tc>
-      </w:tr>
-      <w:tr>
-        <w:tc>
-          <w:tcPr>
-            <w:tcW w:type="dxa" w:w="1928"/>
-            <w:tcBorders>
-              <w:top w:val="single" w:sz="4" w:color="BFBFBF"/>
-              <w:left w:val="single" w:sz="4" w:color="BFBFBF"/>
-              <w:bottom w:val="single" w:sz="4" w:color="BFBFBF"/>
-              <w:right w:val="single" w:sz="4" w:color="BFBFBF"/>
-            </w:tcBorders>
-          </w:tcPr>
-          <w:p>
-            <w:pPr>
-              <w:spacing w:after="0"/>
-              <w:jc w:val="center"/>
-            </w:pPr>
-            <w:r>
-              <w:rPr>
-                <w:rFonts w:ascii="Segoe UI" w:hAnsi="Segoe UI" w:eastAsia="Microsoft JhengHei"/>
-                <w:b/>
-                <w:i w:val="0"/>
-                <w:color w:val="1F2937"/>
-                <w:sz w:val="20"/>
-              </w:rPr>
-              <w:t>A1</w:t>
-            </w:r>
-          </w:p>
-        </w:tc>
-        <w:tc>
-          <w:tcPr>
-            <w:tcW w:type="dxa" w:w="1928"/>
-            <w:tcBorders>
-              <w:top w:val="single" w:sz="4" w:color="BFBFBF"/>
-              <w:left w:val="single" w:sz="4" w:color="BFBFBF"/>
-              <w:bottom w:val="single" w:sz="4" w:color="BFBFBF"/>
-              <w:right w:val="single" w:sz="4" w:color="BFBFBF"/>
-            </w:tcBorders>
-          </w:tcPr>
-          <w:p>
-            <w:pPr>
-              <w:spacing w:after="0"/>
-              <w:jc w:val="center"/>
-            </w:pPr>
-            <w:r>
-              <w:rPr>
-                <w:rFonts w:ascii="Segoe UI" w:hAnsi="Segoe UI" w:eastAsia="Microsoft JhengHei"/>
-                <w:b w:val="0"/>
-                <w:i w:val="0"/>
-                <w:color w:val="6B7280"/>
-                <w:sz w:val="22"/>
-              </w:rPr>
-              <w:t>○</w:t>
-            </w:r>
-          </w:p>
-        </w:tc>
-        <w:tc>
-          <w:tcPr>
-            <w:tcW w:type="dxa" w:w="1928"/>
-            <w:tcBorders>
-              <w:top w:val="single" w:sz="4" w:color="BFBFBF"/>
-              <w:left w:val="single" w:sz="4" w:color="BFBFBF"/>
-              <w:bottom w:val="single" w:sz="4" w:color="BFBFBF"/>
-              <w:right w:val="single" w:sz="4" w:color="BFBFBF"/>
-            </w:tcBorders>
-          </w:tcPr>
-          <w:p>
-            <w:pPr>
-              <w:spacing w:after="0"/>
-              <w:jc w:val="center"/>
-            </w:pPr>
-            <w:r>
-              <w:rPr>
-                <w:rFonts w:ascii="Segoe UI" w:hAnsi="Segoe UI" w:eastAsia="Microsoft JhengHei"/>
-                <w:b w:val="0"/>
-                <w:i w:val="0"/>
-                <w:color w:val="6B7280"/>
-                <w:sz w:val="22"/>
-              </w:rPr>
-              <w:t>○</w:t>
-            </w:r>
-          </w:p>
-        </w:tc>
-        <w:tc>
-          <w:tcPr>
-            <w:tcW w:type="dxa" w:w="1928"/>
-            <w:tcBorders>
-              <w:top w:val="single" w:sz="4" w:color="BFBFBF"/>
-              <w:left w:val="single" w:sz="4" w:color="BFBFBF"/>
-              <w:bottom w:val="single" w:sz="4" w:color="BFBFBF"/>
-              <w:right w:val="single" w:sz="4" w:color="BFBFBF"/>
-            </w:tcBorders>
-          </w:tcPr>
-          <w:p>
-            <w:pPr>
-              <w:spacing w:after="0"/>
-              <w:jc w:val="center"/>
-            </w:pPr>
-            <w:r>
-              <w:rPr>
-                <w:rFonts w:ascii="Segoe UI" w:hAnsi="Segoe UI" w:eastAsia="Microsoft JhengHei"/>
-                <w:b w:val="0"/>
-                <w:i w:val="0"/>
-                <w:color w:val="6B7280"/>
-                <w:sz w:val="22"/>
-              </w:rPr>
-              <w:t>○</w:t>
-            </w:r>
-          </w:p>
-        </w:tc>
-        <w:tc>
-          <w:tcPr>
-            <w:tcW w:type="dxa" w:w="1928"/>
-            <w:tcBorders>
-              <w:top w:val="single" w:sz="4" w:color="BFBFBF"/>
-              <w:left w:val="single" w:sz="4" w:color="BFBFBF"/>
-              <w:bottom w:val="single" w:sz="4" w:color="BFBFBF"/>
-              <w:right w:val="single" w:sz="4" w:color="BFBFBF"/>
-            </w:tcBorders>
-          </w:tcPr>
-          <w:p>
-            <w:pPr>
-              <w:spacing w:after="0"/>
-              <w:jc w:val="center"/>
-            </w:pPr>
-            <w:r>
-              <w:rPr>
-                <w:rFonts w:ascii="Segoe UI" w:hAnsi="Segoe UI" w:eastAsia="Microsoft JhengHei"/>
-                <w:b w:val="0"/>
-                <w:i w:val="0"/>
-                <w:color w:val="6B7280"/>
-                <w:sz w:val="22"/>
-              </w:rPr>
-              <w:t>○</w:t>
-            </w:r>
-          </w:p>
-        </w:tc>
-      </w:tr>
-      <w:tr>
-        <w:tc>
-          <w:tcPr>
-            <w:tcW w:type="dxa" w:w="1928"/>
-            <w:tcBorders>
-              <w:top w:val="single" w:sz="4" w:color="BFBFBF"/>
-              <w:left w:val="single" w:sz="4" w:color="BFBFBF"/>
-              <w:bottom w:val="single" w:sz="4" w:color="BFBFBF"/>
-              <w:right w:val="single" w:sz="4" w:color="BFBFBF"/>
-            </w:tcBorders>
-          </w:tcPr>
-          <w:p>
-            <w:pPr>
-              <w:spacing w:after="0"/>
-              <w:jc w:val="center"/>
-            </w:pPr>
-            <w:r>
-              <w:rPr>
-                <w:rFonts w:ascii="Segoe UI" w:hAnsi="Segoe UI" w:eastAsia="Microsoft JhengHei"/>
-                <w:b/>
-                <w:i w:val="0"/>
-                <w:color w:val="1F2937"/>
-                <w:sz w:val="20"/>
-              </w:rPr>
-              <w:t>A2</w:t>
-            </w:r>
-          </w:p>
-        </w:tc>
-        <w:tc>
-          <w:tcPr>
-            <w:tcW w:type="dxa" w:w="1928"/>
-            <w:tcBorders>
-              <w:top w:val="single" w:sz="4" w:color="BFBFBF"/>
-              <w:left w:val="single" w:sz="4" w:color="BFBFBF"/>
-              <w:bottom w:val="single" w:sz="4" w:color="BFBFBF"/>
-              <w:right w:val="single" w:sz="4" w:color="BFBFBF"/>
-            </w:tcBorders>
-          </w:tcPr>
-          <w:p>
-            <w:pPr>
-              <w:spacing w:after="0"/>
-              <w:jc w:val="center"/>
-            </w:pPr>
-            <w:r>
-              <w:rPr>
-                <w:rFonts w:ascii="Segoe UI" w:hAnsi="Segoe UI" w:eastAsia="Microsoft JhengHei"/>
-                <w:b w:val="0"/>
-                <w:i w:val="0"/>
-                <w:color w:val="6B7280"/>
-                <w:sz w:val="22"/>
-              </w:rPr>
-              <w:t>○</w:t>
-            </w:r>
-          </w:p>
-        </w:tc>
-        <w:tc>
-          <w:tcPr>
-            <w:tcW w:type="dxa" w:w="1928"/>
-            <w:tcBorders>
-              <w:top w:val="single" w:sz="4" w:color="BFBFBF"/>
-              <w:left w:val="single" w:sz="4" w:color="BFBFBF"/>
-              <w:bottom w:val="single" w:sz="4" w:color="BFBFBF"/>
-              <w:right w:val="single" w:sz="4" w:color="BFBFBF"/>
-            </w:tcBorders>
-          </w:tcPr>
-          <w:p>
-            <w:pPr>
-              <w:spacing w:after="0"/>
-              <w:jc w:val="center"/>
-            </w:pPr>
-            <w:r>
-              <w:rPr>
-                <w:rFonts w:ascii="Segoe UI" w:hAnsi="Segoe UI" w:eastAsia="Microsoft JhengHei"/>
-                <w:b w:val="0"/>
-                <w:i w:val="0"/>
-                <w:color w:val="6B7280"/>
-                <w:sz w:val="22"/>
-              </w:rPr>
-              <w:t>○</w:t>
-            </w:r>
-          </w:p>
-        </w:tc>
-        <w:tc>
-          <w:tcPr>
-            <w:tcW w:type="dxa" w:w="1928"/>
-            <w:tcBorders>
-              <w:top w:val="single" w:sz="4" w:color="BFBFBF"/>
-              <w:left w:val="single" w:sz="4" w:color="BFBFBF"/>
-              <w:bottom w:val="single" w:sz="4" w:color="BFBFBF"/>
-              <w:right w:val="single" w:sz="4" w:color="BFBFBF"/>
-            </w:tcBorders>
-          </w:tcPr>
-          <w:p>
-            <w:pPr>
-              <w:spacing w:after="0"/>
-              <w:jc w:val="center"/>
-            </w:pPr>
-            <w:r>
-              <w:rPr>
-                <w:rFonts w:ascii="Segoe UI" w:hAnsi="Segoe UI" w:eastAsia="Microsoft JhengHei"/>
-                <w:b w:val="0"/>
-                <w:i w:val="0"/>
-                <w:color w:val="6B7280"/>
-                <w:sz w:val="22"/>
-              </w:rPr>
-              <w:t>○</w:t>
-            </w:r>
-          </w:p>
-        </w:tc>
-        <w:tc>
-          <w:tcPr>
-            <w:tcW w:type="dxa" w:w="1928"/>
-            <w:tcBorders>
-              <w:top w:val="single" w:sz="4" w:color="BFBFBF"/>
-              <w:left w:val="single" w:sz="4" w:color="BFBFBF"/>
-              <w:bottom w:val="single" w:sz="4" w:color="BFBFBF"/>
-              <w:right w:val="single" w:sz="4" w:color="BFBFBF"/>
-            </w:tcBorders>
-          </w:tcPr>
-          <w:p>
-            <w:pPr>
-              <w:spacing w:after="0"/>
-              <w:jc w:val="center"/>
-            </w:pPr>
-            <w:r>
-              <w:rPr>
-                <w:rFonts w:ascii="Segoe UI" w:hAnsi="Segoe UI" w:eastAsia="Microsoft JhengHei"/>
-                <w:b w:val="0"/>
-                <w:i w:val="0"/>
-                <w:color w:val="6B7280"/>
-                <w:sz w:val="22"/>
-              </w:rPr>
-              <w:t>○</w:t>
-            </w:r>
-          </w:p>
-        </w:tc>
-      </w:tr>
-      <w:tr>
-        <w:tc>
-          <w:tcPr>
-            <w:tcW w:type="dxa" w:w="1928"/>
-            <w:tcBorders>
-              <w:top w:val="single" w:sz="4" w:color="BFBFBF"/>
-              <w:left w:val="single" w:sz="4" w:color="BFBFBF"/>
-              <w:bottom w:val="single" w:sz="4" w:color="BFBFBF"/>
-              <w:right w:val="single" w:sz="4" w:color="BFBFBF"/>
-            </w:tcBorders>
-          </w:tcPr>
-          <w:p>
-            <w:pPr>
-              <w:spacing w:after="0"/>
-              <w:jc w:val="center"/>
-            </w:pPr>
-            <w:r>
-              <w:rPr>
-                <w:rFonts w:ascii="Segoe UI" w:hAnsi="Segoe UI" w:eastAsia="Microsoft JhengHei"/>
-                <w:b/>
-                <w:i w:val="0"/>
-                <w:color w:val="1F2937"/>
-                <w:sz w:val="20"/>
-              </w:rPr>
-              <w:t>A3</w:t>
-            </w:r>
-          </w:p>
-        </w:tc>
-        <w:tc>
-          <w:tcPr>
-            <w:tcW w:type="dxa" w:w="1928"/>
-            <w:tcBorders>
-              <w:top w:val="single" w:sz="4" w:color="BFBFBF"/>
-              <w:left w:val="single" w:sz="4" w:color="BFBFBF"/>
-              <w:bottom w:val="single" w:sz="4" w:color="BFBFBF"/>
-              <w:right w:val="single" w:sz="4" w:color="BFBFBF"/>
-            </w:tcBorders>
-          </w:tcPr>
-          <w:p>
-            <w:pPr>
-              <w:spacing w:after="0"/>
-              <w:jc w:val="center"/>
-            </w:pPr>
-            <w:r>
-              <w:rPr>
-                <w:rFonts w:ascii="Segoe UI" w:hAnsi="Segoe UI" w:eastAsia="Microsoft JhengHei"/>
-                <w:b w:val="0"/>
-                <w:i w:val="0"/>
-                <w:color w:val="6B7280"/>
-                <w:sz w:val="22"/>
-              </w:rPr>
-              <w:t>○</w:t>
-            </w:r>
-          </w:p>
-        </w:tc>
-        <w:tc>
-          <w:tcPr>
-            <w:tcW w:type="dxa" w:w="1928"/>
-            <w:tcBorders>
-              <w:top w:val="single" w:sz="4" w:color="BFBFBF"/>
-              <w:left w:val="single" w:sz="4" w:color="BFBFBF"/>
-              <w:bottom w:val="single" w:sz="4" w:color="BFBFBF"/>
-              <w:right w:val="single" w:sz="4" w:color="BFBFBF"/>
-            </w:tcBorders>
-          </w:tcPr>
-          <w:p>
-            <w:pPr>
-              <w:spacing w:after="0"/>
-              <w:jc w:val="center"/>
-            </w:pPr>
-            <w:r>
-              <w:rPr>
-                <w:rFonts w:ascii="Segoe UI" w:hAnsi="Segoe UI" w:eastAsia="Microsoft JhengHei"/>
-                <w:b w:val="0"/>
-                <w:i w:val="0"/>
-                <w:color w:val="6B7280"/>
-                <w:sz w:val="22"/>
-              </w:rPr>
-              <w:t>○</w:t>
-            </w:r>
-          </w:p>
-        </w:tc>
-        <w:tc>
-          <w:tcPr>
-            <w:tcW w:type="dxa" w:w="1928"/>
-            <w:tcBorders>
-              <w:top w:val="single" w:sz="4" w:color="BFBFBF"/>
-              <w:left w:val="single" w:sz="4" w:color="BFBFBF"/>
-              <w:bottom w:val="single" w:sz="4" w:color="BFBFBF"/>
-              <w:right w:val="single" w:sz="4" w:color="BFBFBF"/>
-            </w:tcBorders>
-          </w:tcPr>
-          <w:p>
-            <w:pPr>
-              <w:spacing w:after="0"/>
-              <w:jc w:val="center"/>
-            </w:pPr>
-            <w:r>
-              <w:rPr>
-                <w:rFonts w:ascii="Segoe UI" w:hAnsi="Segoe UI" w:eastAsia="Microsoft JhengHei"/>
-                <w:b w:val="0"/>
-                <w:i w:val="0"/>
-                <w:color w:val="6B7280"/>
-                <w:sz w:val="22"/>
-              </w:rPr>
-              <w:t>○</w:t>
-            </w:r>
-          </w:p>
-        </w:tc>
-        <w:tc>
-          <w:tcPr>
-            <w:tcW w:type="dxa" w:w="1928"/>
-            <w:tcBorders>
-              <w:top w:val="single" w:sz="4" w:color="BFBFBF"/>
-              <w:left w:val="single" w:sz="4" w:color="BFBFBF"/>
-              <w:bottom w:val="single" w:sz="4" w:color="BFBFBF"/>
-              <w:right w:val="single" w:sz="4" w:color="BFBFBF"/>
-            </w:tcBorders>
-          </w:tcPr>
-          <w:p>
-            <w:pPr>
-              <w:spacing w:after="0"/>
-              <w:jc w:val="center"/>
-            </w:pPr>
-            <w:r>
-              <w:rPr>
-                <w:rFonts w:ascii="Segoe UI" w:hAnsi="Segoe UI" w:eastAsia="Microsoft JhengHei"/>
-                <w:b w:val="0"/>
-                <w:i w:val="0"/>
-                <w:color w:val="6B7280"/>
-                <w:sz w:val="22"/>
-              </w:rPr>
-              <w:t>○</w:t>
-            </w:r>
-          </w:p>
-        </w:tc>
-      </w:tr>
-      <w:tr>
-        <w:tc>
-          <w:tcPr>
-            <w:tcW w:type="dxa" w:w="1928"/>
-            <w:tcBorders>
-              <w:top w:val="single" w:sz="4" w:color="BFBFBF"/>
-              <w:left w:val="single" w:sz="4" w:color="BFBFBF"/>
-              <w:bottom w:val="single" w:sz="4" w:color="BFBFBF"/>
-              <w:right w:val="single" w:sz="4" w:color="BFBFBF"/>
-            </w:tcBorders>
-          </w:tcPr>
-          <w:p>
-            <w:pPr>
-              <w:spacing w:after="0"/>
-              <w:jc w:val="center"/>
-            </w:pPr>
-            <w:r>
-              <w:rPr>
-                <w:rFonts w:ascii="Segoe UI" w:hAnsi="Segoe UI" w:eastAsia="Microsoft JhengHei"/>
-                <w:b/>
-                <w:i w:val="0"/>
-                <w:color w:val="1F2937"/>
-                <w:sz w:val="20"/>
-              </w:rPr>
-              <w:t>A4</w:t>
-            </w:r>
-          </w:p>
-        </w:tc>
-        <w:tc>
-          <w:tcPr>
-            <w:tcW w:type="dxa" w:w="1928"/>
-            <w:tcBorders>
-              <w:top w:val="single" w:sz="4" w:color="BFBFBF"/>
-              <w:left w:val="single" w:sz="4" w:color="BFBFBF"/>
-              <w:bottom w:val="single" w:sz="4" w:color="BFBFBF"/>
-              <w:right w:val="single" w:sz="4" w:color="BFBFBF"/>
-            </w:tcBorders>
-          </w:tcPr>
-          <w:p>
-            <w:pPr>
-              <w:spacing w:after="0"/>
-              <w:jc w:val="center"/>
-            </w:pPr>
-            <w:r>
-              <w:rPr>
-                <w:rFonts w:ascii="Segoe UI" w:hAnsi="Segoe UI" w:eastAsia="Microsoft JhengHei"/>
-                <w:b w:val="0"/>
-                <w:i w:val="0"/>
-                <w:color w:val="6B7280"/>
-                <w:sz w:val="22"/>
-              </w:rPr>
-              <w:t>○</w:t>
-            </w:r>
-          </w:p>
-        </w:tc>
-        <w:tc>
-          <w:tcPr>
-            <w:tcW w:type="dxa" w:w="1928"/>
-            <w:tcBorders>
-              <w:top w:val="single" w:sz="4" w:color="BFBFBF"/>
-              <w:left w:val="single" w:sz="4" w:color="BFBFBF"/>
-              <w:bottom w:val="single" w:sz="4" w:color="BFBFBF"/>
-              <w:right w:val="single" w:sz="4" w:color="BFBFBF"/>
-            </w:tcBorders>
-          </w:tcPr>
-          <w:p>
-            <w:pPr>
-              <w:spacing w:after="0"/>
-              <w:jc w:val="center"/>
-            </w:pPr>
-            <w:r>
-              <w:rPr>
-                <w:rFonts w:ascii="Segoe UI" w:hAnsi="Segoe UI" w:eastAsia="Microsoft JhengHei"/>
-                <w:b w:val="0"/>
-                <w:i w:val="0"/>
-                <w:color w:val="6B7280"/>
-                <w:sz w:val="22"/>
-              </w:rPr>
-              <w:t>○</w:t>
-            </w:r>
-          </w:p>
-        </w:tc>
-        <w:tc>
-          <w:tcPr>
-            <w:tcW w:type="dxa" w:w="1928"/>
-            <w:tcBorders>
-              <w:top w:val="single" w:sz="4" w:color="BFBFBF"/>
-              <w:left w:val="single" w:sz="4" w:color="BFBFBF"/>
-              <w:bottom w:val="single" w:sz="4" w:color="BFBFBF"/>
-              <w:right w:val="single" w:sz="4" w:color="BFBFBF"/>
-            </w:tcBorders>
-          </w:tcPr>
-          <w:p>
-            <w:pPr>
-              <w:spacing w:after="0"/>
-              <w:jc w:val="center"/>
-            </w:pPr>
-            <w:r>
-              <w:rPr>
-                <w:rFonts w:ascii="Segoe UI" w:hAnsi="Segoe UI" w:eastAsia="Microsoft JhengHei"/>
-                <w:b w:val="0"/>
-                <w:i w:val="0"/>
-                <w:color w:val="6B7280"/>
-                <w:sz w:val="22"/>
-              </w:rPr>
-              <w:t>○</w:t>
-            </w:r>
-          </w:p>
-        </w:tc>
-        <w:tc>
-          <w:tcPr>
-            <w:tcW w:type="dxa" w:w="1928"/>
-            <w:tcBorders>
-              <w:top w:val="single" w:sz="4" w:color="BFBFBF"/>
-              <w:left w:val="single" w:sz="4" w:color="BFBFBF"/>
-              <w:bottom w:val="single" w:sz="4" w:color="BFBFBF"/>
-              <w:right w:val="single" w:sz="4" w:color="BFBFBF"/>
-            </w:tcBorders>
-          </w:tcPr>
-          <w:p>
-            <w:pPr>
-              <w:spacing w:after="0"/>
-              <w:jc w:val="center"/>
-            </w:pPr>
-            <w:r>
-              <w:rPr>
-                <w:rFonts w:ascii="Segoe UI" w:hAnsi="Segoe UI" w:eastAsia="Microsoft JhengHei"/>
-                <w:b w:val="0"/>
-                <w:i w:val="0"/>
-                <w:color w:val="6B7280"/>
-                <w:sz w:val="22"/>
-              </w:rPr>
-              <w:t>○</w:t>
-            </w:r>
-          </w:p>
-        </w:tc>
-      </w:tr>
-    </w:tbl>
     <w:p>
       <w:pPr>
         <w:keepNext/>
@@ -1586,7 +1572,7 @@
           <w:color w:val="1D4ED8"/>
           <w:sz w:val="25"/>
         </w:rPr>
-        <w:t>乙部　Section B · Conventional questions</w:t>
+        <w:t>Section B · Conventional questions (22 marks in all)</w:t>
       </w:r>
       <w:r>
         <w:rPr>
@@ -1596,7 +1582,7 @@
           <w:color w:val="6B7280"/>
           <w:sz w:val="20"/>
         </w:rPr>
-        <w:t xml:space="preserve">　（共 22 分 · 22 marks）</w:t>
+        <w:t xml:space="preserve"> (22 marks)</w:t>
       </w:r>
     </w:p>
     <w:p>
@@ -1622,24 +1608,7 @@
           <w:color w:val="6B7280"/>
           <w:sz w:val="19"/>
         </w:rPr>
-        <w:t>[3 分]</w:t>
-      </w:r>
-    </w:p>
-    <w:p>
-      <w:pPr>
-        <w:keepNext/>
-        <w:spacing w:after="20" w:before="0" w:line="300" w:lineRule="auto"/>
-        <w:ind w:left="340"/>
-      </w:pPr>
-      <w:r>
-        <w:rPr>
-          <w:rFonts w:ascii="Segoe UI" w:hAnsi="Segoe UI" w:eastAsia="Microsoft JhengHei"/>
-          <w:b w:val="0"/>
-          <w:i w:val="0"/>
-          <w:color w:val="1F2937"/>
-          <w:sz w:val="21"/>
-        </w:rPr>
-        <w:t>A card is chosen from a deck of 52 playing cards. Find the number of ways of choosing</w:t>
+        <w:t>[3 marks]</w:t>
       </w:r>
     </w:p>
     <w:p>
@@ -1653,10 +1622,10 @@
           <w:rFonts w:ascii="Segoe UI" w:hAnsi="Segoe UI" w:eastAsia="Microsoft JhengHei"/>
           <w:b w:val="0"/>
           <w:i w:val="0"/>
-          <w:color w:val="6B7280"/>
-          <w:sz w:val="19"/>
+          <w:color w:val="1F2937"/>
+          <w:sz w:val="21"/>
         </w:rPr>
-        <w:t>從一副 52 張的扑克牌中揀一張，求揀法數目：</w:t>
+        <w:t>A card is chosen from a deck of 52 playing cards. Find the number of ways of choosing</w:t>
       </w:r>
     </w:p>
     <w:p>
@@ -1683,24 +1652,7 @@
           <w:color w:val="6B7280"/>
           <w:sz w:val="19"/>
         </w:rPr>
-        <w:t xml:space="preserve">  [1 分]</w:t>
-      </w:r>
-    </w:p>
-    <w:p>
-      <w:pPr>
-        <w:keepNext/>
-        <w:spacing w:after="40" w:before="0" w:line="300" w:lineRule="auto"/>
-        <w:ind w:left="510"/>
-      </w:pPr>
-      <w:r>
-        <w:rPr>
-          <w:rFonts w:ascii="Segoe UI" w:hAnsi="Segoe UI" w:eastAsia="Microsoft JhengHei"/>
-          <w:b w:val="0"/>
-          <w:i w:val="0"/>
-          <w:color w:val="6B7280"/>
-          <w:sz w:val="19"/>
-        </w:rPr>
-        <w:t>一張『4』、一張『6』或一張『9』；</w:t>
+        <w:t xml:space="preserve">  [1 mark]</w:t>
       </w:r>
     </w:p>
     <w:p>
@@ -1727,24 +1679,7 @@
           <w:color w:val="6B7280"/>
           <w:sz w:val="19"/>
         </w:rPr>
-        <w:t xml:space="preserve">  [2 分]</w:t>
-      </w:r>
-    </w:p>
-    <w:p>
-      <w:pPr>
-        <w:keepNext/>
-        <w:spacing w:after="40" w:before="0" w:line="300" w:lineRule="auto"/>
-        <w:ind w:left="510"/>
-      </w:pPr>
-      <w:r>
-        <w:rPr>
-          <w:rFonts w:ascii="Segoe UI" w:hAnsi="Segoe UI" w:eastAsia="Microsoft JhengHei"/>
-          <w:b w:val="0"/>
-          <w:i w:val="0"/>
-          <w:color w:val="6B7280"/>
-          <w:sz w:val="19"/>
-        </w:rPr>
-        <w:t>一張『7』或一張紅桃。</w:t>
+        <w:t xml:space="preserve">  [2 marks]</w:t>
       </w:r>
     </w:p>
     <w:tbl>
@@ -1871,24 +1806,7 @@
           <w:color w:val="6B7280"/>
           <w:sz w:val="19"/>
         </w:rPr>
-        <w:t>[3 分]</w:t>
-      </w:r>
-    </w:p>
-    <w:p>
-      <w:pPr>
-        <w:keepNext/>
-        <w:spacing w:after="20" w:before="0" w:line="300" w:lineRule="auto"/>
-        <w:ind w:left="340"/>
-      </w:pPr>
-      <w:r>
-        <w:rPr>
-          <w:rFonts w:ascii="Segoe UI" w:hAnsi="Segoe UI" w:eastAsia="Microsoft JhengHei"/>
-          <w:b w:val="0"/>
-          <w:i w:val="0"/>
-          <w:color w:val="1F2937"/>
-          <w:sz w:val="21"/>
-        </w:rPr>
-        <w:t>A nine-digit password is formed by a permutation of 1, 2, 3, 4, 5, 6, 7, 8 and 9.</w:t>
+        <w:t>[3 marks]</w:t>
       </w:r>
     </w:p>
     <w:p>
@@ -1902,10 +1820,10 @@
           <w:rFonts w:ascii="Segoe UI" w:hAnsi="Segoe UI" w:eastAsia="Microsoft JhengHei"/>
           <w:b w:val="0"/>
           <w:i w:val="0"/>
-          <w:color w:val="6B7280"/>
-          <w:sz w:val="19"/>
+          <w:color w:val="1F2937"/>
+          <w:sz w:val="21"/>
         </w:rPr>
-        <w:t>一個九位密碼由 1 至 9 排列而成。</w:t>
+        <w:t>A nine-digit password is formed by a permutation of 1, 2, 3, 4, 5, 6, 7, 8 and 9.</w:t>
       </w:r>
     </w:p>
     <w:p>
@@ -1932,24 +1850,7 @@
           <w:color w:val="6B7280"/>
           <w:sz w:val="19"/>
         </w:rPr>
-        <w:t xml:space="preserve">  [1 分]</w:t>
-      </w:r>
-    </w:p>
-    <w:p>
-      <w:pPr>
-        <w:keepNext/>
-        <w:spacing w:after="40" w:before="0" w:line="300" w:lineRule="auto"/>
-        <w:ind w:left="510"/>
-      </w:pPr>
-      <w:r>
-        <w:rPr>
-          <w:rFonts w:ascii="Segoe UI" w:hAnsi="Segoe UI" w:eastAsia="Microsoft JhengHei"/>
-          <w:b w:val="0"/>
-          <w:i w:val="0"/>
-          <w:color w:val="6B7280"/>
-          <w:sz w:val="19"/>
-        </w:rPr>
-        <w:t>可以組成多少個不同的九位密碼？</w:t>
+        <w:t xml:space="preserve">  [1 mark]</w:t>
       </w:r>
     </w:p>
     <w:p>
@@ -1976,24 +1877,7 @@
           <w:color w:val="6B7280"/>
           <w:sz w:val="19"/>
         </w:rPr>
-        <w:t xml:space="preserve">  [2 分]</w:t>
-      </w:r>
-    </w:p>
-    <w:p>
-      <w:pPr>
-        <w:keepNext/>
-        <w:spacing w:after="40" w:before="0" w:line="300" w:lineRule="auto"/>
-        <w:ind w:left="510"/>
-      </w:pPr>
-      <w:r>
-        <w:rPr>
-          <w:rFonts w:ascii="Segoe UI" w:hAnsi="Segoe UI" w:eastAsia="Microsoft JhengHei"/>
-          <w:b w:val="0"/>
-          <w:i w:val="0"/>
-          <w:color w:val="6B7280"/>
-          <w:sz w:val="19"/>
-        </w:rPr>
-        <w:t>若密碼的首位與末位都是偶數，可以組成多少個不同的九位密碼？</w:t>
+        <w:t xml:space="preserve">  [2 marks]</w:t>
       </w:r>
     </w:p>
     <w:tbl>
@@ -2120,24 +2004,7 @@
           <w:color w:val="6B7280"/>
           <w:sz w:val="19"/>
         </w:rPr>
-        <w:t>[4 分]</w:t>
-      </w:r>
-    </w:p>
-    <w:p>
-      <w:pPr>
-        <w:keepNext/>
-        <w:spacing w:after="20" w:before="0" w:line="300" w:lineRule="auto"/>
-        <w:ind w:left="340"/>
-      </w:pPr>
-      <w:r>
-        <w:rPr>
-          <w:rFonts w:ascii="Segoe UI" w:hAnsi="Segoe UI" w:eastAsia="Microsoft JhengHei"/>
-          <w:b w:val="0"/>
-          <w:i w:val="0"/>
-          <w:color w:val="1F2937"/>
-          <w:sz w:val="21"/>
-        </w:rPr>
-        <w:t>A group of boys and girls are arranged in a row to take a photo. In each of the following, find the number of arrangements if all the boys and all the girls stand in alternate positions.</w:t>
+        <w:t>[4 marks]</w:t>
       </w:r>
     </w:p>
     <w:p>
@@ -2151,10 +2018,10 @@
           <w:rFonts w:ascii="Segoe UI" w:hAnsi="Segoe UI" w:eastAsia="Microsoft JhengHei"/>
           <w:b w:val="0"/>
           <w:i w:val="0"/>
-          <w:color w:val="6B7280"/>
-          <w:sz w:val="19"/>
+          <w:color w:val="1F2937"/>
+          <w:sz w:val="21"/>
         </w:rPr>
-        <w:t>一組男女生排成一排影相。在下列各情況，求所有男生與所有女生相間排列的方法數。</w:t>
+        <w:t>A group of boys and girls are arranged in a row to take a photo. In each of the following, find the number of arrangements if all the boys and all the girls stand in alternate positions.</w:t>
       </w:r>
     </w:p>
     <w:p>
@@ -2181,24 +2048,7 @@
           <w:color w:val="6B7280"/>
           <w:sz w:val="19"/>
         </w:rPr>
-        <w:t xml:space="preserve">  [2 分]</w:t>
-      </w:r>
-    </w:p>
-    <w:p>
-      <w:pPr>
-        <w:keepNext/>
-        <w:spacing w:after="40" w:before="0" w:line="300" w:lineRule="auto"/>
-        <w:ind w:left="510"/>
-      </w:pPr>
-      <w:r>
-        <w:rPr>
-          <w:rFonts w:ascii="Segoe UI" w:hAnsi="Segoe UI" w:eastAsia="Microsoft JhengHei"/>
-          <w:b w:val="0"/>
-          <w:i w:val="0"/>
-          <w:color w:val="6B7280"/>
-          <w:sz w:val="19"/>
-        </w:rPr>
-        <w:t>組內有 5 男 6 女。</w:t>
+        <w:t xml:space="preserve">  [2 marks]</w:t>
       </w:r>
     </w:p>
     <w:p>
@@ -2225,24 +2075,7 @@
           <w:color w:val="6B7280"/>
           <w:sz w:val="19"/>
         </w:rPr>
-        <w:t xml:space="preserve">  [2 分]</w:t>
-      </w:r>
-    </w:p>
-    <w:p>
-      <w:pPr>
-        <w:keepNext/>
-        <w:spacing w:after="40" w:before="0" w:line="300" w:lineRule="auto"/>
-        <w:ind w:left="510"/>
-      </w:pPr>
-      <w:r>
-        <w:rPr>
-          <w:rFonts w:ascii="Segoe UI" w:hAnsi="Segoe UI" w:eastAsia="Microsoft JhengHei"/>
-          <w:b w:val="0"/>
-          <w:i w:val="0"/>
-          <w:color w:val="6B7280"/>
-          <w:sz w:val="19"/>
-        </w:rPr>
-        <w:t>組內有 6 男 6 女。</w:t>
+        <w:t xml:space="preserve">  [2 marks]</w:t>
       </w:r>
     </w:p>
     <w:tbl>
@@ -2386,24 +2219,7 @@
           <w:color w:val="6B7280"/>
           <w:sz w:val="19"/>
         </w:rPr>
-        <w:t>[5 分]</w:t>
-      </w:r>
-    </w:p>
-    <w:p>
-      <w:pPr>
-        <w:keepNext/>
-        <w:spacing w:after="20" w:before="0" w:line="300" w:lineRule="auto"/>
-        <w:ind w:left="340"/>
-      </w:pPr>
-      <w:r>
-        <w:rPr>
-          <w:rFonts w:ascii="Segoe UI" w:hAnsi="Segoe UI" w:eastAsia="Microsoft JhengHei"/>
-          <w:b w:val="0"/>
-          <w:i w:val="0"/>
-          <w:color w:val="1F2937"/>
-          <w:sz w:val="21"/>
-        </w:rPr>
-        <w:t>Harry, Ivan, Jerry and 5 friends are arranged to sit in a row. In how many ways can they be seated if</w:t>
+        <w:t>[5 marks]</w:t>
       </w:r>
     </w:p>
     <w:p>
@@ -2417,10 +2233,10 @@
           <w:rFonts w:ascii="Segoe UI" w:hAnsi="Segoe UI" w:eastAsia="Microsoft JhengHei"/>
           <w:b w:val="0"/>
           <w:i w:val="0"/>
-          <w:color w:val="6B7280"/>
-          <w:sz w:val="19"/>
+          <w:color w:val="1F2937"/>
+          <w:sz w:val="21"/>
         </w:rPr>
-        <w:t>Harry、Ivan、Jerry 與另外 5 位朋友排成一排坐。求下列情況的排法數：</w:t>
+        <w:t>Harry, Ivan, Jerry and 5 friends are arranged to sit in a row. In how many ways can they be seated if</w:t>
       </w:r>
     </w:p>
     <w:p>
@@ -2447,24 +2263,7 @@
           <w:color w:val="6B7280"/>
           <w:sz w:val="19"/>
         </w:rPr>
-        <w:t xml:space="preserve">  [2 分]</w:t>
-      </w:r>
-    </w:p>
-    <w:p>
-      <w:pPr>
-        <w:keepNext/>
-        <w:spacing w:after="40" w:before="0" w:line="300" w:lineRule="auto"/>
-        <w:ind w:left="510"/>
-      </w:pPr>
-      <w:r>
-        <w:rPr>
-          <w:rFonts w:ascii="Segoe UI" w:hAnsi="Segoe UI" w:eastAsia="Microsoft JhengHei"/>
-          <w:b w:val="0"/>
-          <w:i w:val="0"/>
-          <w:color w:val="6B7280"/>
-          <w:sz w:val="19"/>
-        </w:rPr>
-        <w:t>Harry、Ivan、Jerry 三人坐埋一齊？</w:t>
+        <w:t xml:space="preserve">  [2 marks]</w:t>
       </w:r>
     </w:p>
     <w:p>
@@ -2491,24 +2290,7 @@
           <w:color w:val="6B7280"/>
           <w:sz w:val="19"/>
         </w:rPr>
-        <w:t xml:space="preserve">  [3 分]</w:t>
-      </w:r>
-    </w:p>
-    <w:p>
-      <w:pPr>
-        <w:keepNext/>
-        <w:spacing w:after="40" w:before="0" w:line="300" w:lineRule="auto"/>
-        <w:ind w:left="510"/>
-      </w:pPr>
-      <w:r>
-        <w:rPr>
-          <w:rFonts w:ascii="Segoe UI" w:hAnsi="Segoe UI" w:eastAsia="Microsoft JhengHei"/>
-          <w:b w:val="0"/>
-          <w:i w:val="0"/>
-          <w:color w:val="6B7280"/>
-          <w:sz w:val="19"/>
-        </w:rPr>
-        <w:t>Harry、Ivan、Jerry 任何兩人都唔相鄰？</w:t>
+        <w:t xml:space="preserve">  [3 marks]</w:t>
       </w:r>
     </w:p>
     <w:tbl>
@@ -2669,24 +2451,7 @@
           <w:color w:val="6B7280"/>
           <w:sz w:val="19"/>
         </w:rPr>
-        <w:t>[3 分]</w:t>
-      </w:r>
-    </w:p>
-    <w:p>
-      <w:pPr>
-        <w:keepNext/>
-        <w:spacing w:after="20" w:before="0" w:line="300" w:lineRule="auto"/>
-        <w:ind w:left="340"/>
-      </w:pPr>
-      <w:r>
-        <w:rPr>
-          <w:rFonts w:ascii="Segoe UI" w:hAnsi="Segoe UI" w:eastAsia="Microsoft JhengHei"/>
-          <w:b w:val="0"/>
-          <w:i w:val="0"/>
-          <w:color w:val="1F2937"/>
-          <w:sz w:val="21"/>
-        </w:rPr>
-        <w:t>There are 18 junior students and 12 senior students in an astronomy club.</w:t>
+        <w:t>[3 marks]</w:t>
       </w:r>
     </w:p>
     <w:p>
@@ -2700,10 +2465,10 @@
           <w:rFonts w:ascii="Segoe UI" w:hAnsi="Segoe UI" w:eastAsia="Microsoft JhengHei"/>
           <w:b w:val="0"/>
           <w:i w:val="0"/>
-          <w:color w:val="6B7280"/>
-          <w:sz w:val="19"/>
+          <w:color w:val="1F2937"/>
+          <w:sz w:val="21"/>
         </w:rPr>
-        <w:t>一個天文學會有 18 名初中生與 12 名高中生。</w:t>
+        <w:t>There are 18 junior students and 12 senior students in an astronomy club.</w:t>
       </w:r>
     </w:p>
     <w:p>
@@ -2730,24 +2495,7 @@
           <w:color w:val="6B7280"/>
           <w:sz w:val="19"/>
         </w:rPr>
-        <w:t xml:space="preserve">  [3 分]</w:t>
-      </w:r>
-    </w:p>
-    <w:p>
-      <w:pPr>
-        <w:keepNext/>
-        <w:spacing w:after="40" w:before="0" w:line="300" w:lineRule="auto"/>
-        <w:ind w:left="510"/>
-      </w:pPr>
-      <w:r>
-        <w:rPr>
-          <w:rFonts w:ascii="Segoe UI" w:hAnsi="Segoe UI" w:eastAsia="Microsoft JhengHei"/>
-          <w:b w:val="0"/>
-          <w:i w:val="0"/>
-          <w:color w:val="6B7280"/>
-          <w:sz w:val="19"/>
-        </w:rPr>
-        <w:t>若從會中選出 4 名學生組成隊伍，當中至少有 1 名高中生，可以組成多少支不同的隊伍？</w:t>
+        <w:t xml:space="preserve">  [3 marks]</w:t>
       </w:r>
     </w:p>
     <w:tbl>
@@ -2874,24 +2622,7 @@
           <w:color w:val="6B7280"/>
           <w:sz w:val="19"/>
         </w:rPr>
-        <w:t>[4 分]</w:t>
-      </w:r>
-    </w:p>
-    <w:p>
-      <w:pPr>
-        <w:keepNext/>
-        <w:spacing w:after="20" w:before="0" w:line="300" w:lineRule="auto"/>
-        <w:ind w:left="340"/>
-      </w:pPr>
-      <w:r>
-        <w:rPr>
-          <w:rFonts w:ascii="Segoe UI" w:hAnsi="Segoe UI" w:eastAsia="Microsoft JhengHei"/>
-          <w:b w:val="0"/>
-          <w:i w:val="0"/>
-          <w:color w:val="1F2937"/>
-          <w:sz w:val="21"/>
-        </w:rPr>
-        <w:t>On a bookshelf, there are 12 different Chinese books and 8 different English books.</w:t>
+        <w:t>[4 marks]</w:t>
       </w:r>
     </w:p>
     <w:p>
@@ -2905,10 +2636,10 @@
           <w:rFonts w:ascii="Segoe UI" w:hAnsi="Segoe UI" w:eastAsia="Microsoft JhengHei"/>
           <w:b w:val="0"/>
           <w:i w:val="0"/>
-          <w:color w:val="6B7280"/>
-          <w:sz w:val="19"/>
+          <w:color w:val="1F2937"/>
+          <w:sz w:val="21"/>
         </w:rPr>
-        <w:t>一個書架上有 12 本不同的中文書與 8 本不同的英文書。</w:t>
+        <w:t>On a bookshelf, there are 12 different Chinese books and 8 different English books.</w:t>
       </w:r>
     </w:p>
     <w:p>
@@ -2935,24 +2666,7 @@
           <w:color w:val="6B7280"/>
           <w:sz w:val="19"/>
         </w:rPr>
-        <w:t xml:space="preserve">  [4 分]</w:t>
-      </w:r>
-    </w:p>
-    <w:p>
-      <w:pPr>
-        <w:keepNext/>
-        <w:spacing w:after="40" w:before="0" w:line="300" w:lineRule="auto"/>
-        <w:ind w:left="510"/>
-      </w:pPr>
-      <w:r>
-        <w:rPr>
-          <w:rFonts w:ascii="Segoe UI" w:hAnsi="Segoe UI" w:eastAsia="Microsoft JhengHei"/>
-          <w:b w:val="0"/>
-          <w:i w:val="0"/>
-          <w:color w:val="6B7280"/>
-          <w:sz w:val="19"/>
-        </w:rPr>
-        <w:t>若從架上選出 5 本書，求選到英文書至多 2 本的方法數。</w:t>
+        <w:t xml:space="preserve">  [4 marks]</w:t>
       </w:r>
     </w:p>
     <w:tbl>
@@ -3091,7 +2805,7 @@
           <w:color w:val="1D4ED8"/>
           <w:sz w:val="28"/>
         </w:rPr>
-        <w:t>公式速查與常犯陷阱 ／ Formula sheet and common traps</w:t>
+        <w:t>Formula sheet and common traps</w:t>
       </w:r>
     </w:p>
     <w:p>
@@ -3107,7 +2821,7 @@
           <w:color w:val="1F2937"/>
           <w:sz w:val="23"/>
         </w:rPr>
-        <w:t>排列 Permutations</w:t>
+        <w:t>Permutations</w:t>
       </w:r>
     </w:p>
     <w:p>
@@ -3124,7 +2838,7 @@
           <w:color w:val="1F2937"/>
           <w:sz w:val="20"/>
         </w:rPr>
-        <w:t>・n 件全部排一次： n!</w:t>
+        <w:t>・Arrange all n objects: n!</w:t>
       </w:r>
     </w:p>
     <w:p>
@@ -3141,7 +2855,7 @@
           <w:color w:val="1F2937"/>
           <w:sz w:val="20"/>
         </w:rPr>
-        <w:t>・從 n 件揀 r 件排： P(n,r) = n! ÷ (n − r)!</w:t>
+        <w:t>・Arrange r objects chosen from n: P(n,r) = n! ÷ (n − r)!</w:t>
       </w:r>
     </w:p>
     <w:p>
@@ -3158,7 +2872,7 @@
           <w:color w:val="1F2937"/>
           <w:sz w:val="20"/>
         </w:rPr>
-        <w:t>・綑綁（必須相鄰）：(人數 − 1) 件排 × 框內排列</w:t>
+        <w:t>・Tie-up (must sit together): arrange one unit fewer, then multiply by the orders inside the block</w:t>
       </w:r>
     </w:p>
     <w:p>
@@ -3175,7 +2889,7 @@
           <w:color w:val="1F2937"/>
           <w:sz w:val="20"/>
         </w:rPr>
-        <w:t>・插空（唔可以相鄰）：先排其他人，空隙 = 人數 + 1，每個空隙最多放一人</w:t>
+        <w:t>・Slot-in (must not sit together): seat the others first; gaps = number of people + 1, at most one person per gap</w:t>
       </w:r>
     </w:p>
     <w:p>
@@ -3191,7 +2905,7 @@
           <w:color w:val="1F2937"/>
           <w:sz w:val="23"/>
         </w:rPr>
-        <w:t>組合 Combinations</w:t>
+        <w:t>Combinations</w:t>
       </w:r>
     </w:p>
     <w:p>
@@ -3208,7 +2922,7 @@
           <w:color w:val="1F2937"/>
           <w:sz w:val="20"/>
         </w:rPr>
-        <w:t>・從 n 件揀 r 件（次序唔緊要）： C(n,r) = n! ÷ (r! × (n − r)!)</w:t>
+        <w:t>・Choose r objects from n (order ignored): C(n,r) = n! ÷ (r! × (n − r)!)</w:t>
       </w:r>
     </w:p>
     <w:p>
@@ -3225,7 +2939,7 @@
           <w:color w:val="1F2937"/>
           <w:sz w:val="20"/>
         </w:rPr>
-        <w:t>・P(n,r) = C(n,r) × r!（排法 = 揀法 × 排列）</w:t>
+        <w:t>・P(n,r) = C(n,r) × r! (arrangements = choices × orders)</w:t>
       </w:r>
     </w:p>
     <w:p>
@@ -3242,7 +2956,7 @@
           <w:color w:val="1F2937"/>
           <w:sz w:val="20"/>
         </w:rPr>
-        <w:t>・分類相加：case 之間用加法，case 之內用乘法</w:t>
+        <w:t>・Case splitting: add between cases, multiply within a case</w:t>
       </w:r>
     </w:p>
     <w:p>
@@ -3259,7 +2973,7 @@
           <w:color w:val="1F2937"/>
           <w:sz w:val="20"/>
         </w:rPr>
-        <w:t>・「至少⋯⋯」：全部 − 完全唔合條件嗰組（反面）</w:t>
+        <w:t>・'At least ...': all ways − the ways that fail the condition (complement)</w:t>
       </w:r>
     </w:p>
     <w:p>
@@ -3276,7 +2990,7 @@
           <w:color w:val="1F2937"/>
           <w:sz w:val="20"/>
         </w:rPr>
-        <w:t>・「至多 n 個」：0、1、⋯、n 共 n + 1 個 case</w:t>
+        <w:t>・'At most n': 0, 1, …, n gives n + 1 cases</w:t>
       </w:r>
     </w:p>
     <w:p>
@@ -3292,7 +3006,7 @@
           <w:color w:val="1F2937"/>
           <w:sz w:val="23"/>
         </w:rPr>
-        <w:t>計數基本原理 Counting principles</w:t>
+        <w:t>Counting principles</w:t>
       </w:r>
     </w:p>
     <w:p>
@@ -3309,7 +3023,7 @@
           <w:color w:val="1F2937"/>
           <w:sz w:val="20"/>
         </w:rPr>
-        <w:t>・分類（揀一種做法）：加法；步驟（做一件接一件）：乘法</w:t>
+        <w:t>・Cases (choose one way): add; steps (do one after another): multiply</w:t>
       </w:r>
     </w:p>
     <w:p>
@@ -3326,7 +3040,7 @@
           <w:color w:val="1F2937"/>
           <w:sz w:val="20"/>
         </w:rPr>
-        <w:t>・「或」＝分類用加法，但要先問兩類會否重疊（重疊就減交集）</w:t>
+        <w:t>・'Or' = add between cases, but first check whether the cases overlap (if so, subtract the intersection)</w:t>
       </w:r>
     </w:p>
     <w:p>
@@ -3343,7 +3057,7 @@
           <w:color w:val="1F2937"/>
           <w:sz w:val="20"/>
         </w:rPr>
-        <w:t>・密碼／號碼：次序緊要，用排列；有位置限制就先處理受限制嗰個位</w:t>
+        <w:t>・Passwords / codes: order matters, so use permutations; handle the restricted positions first</w:t>
       </w:r>
     </w:p>
     <w:sectPr>
@@ -3372,7 +3086,7 @@
         <w:color w:val="6B7280"/>
         <w:sz w:val="18"/>
       </w:rPr>
-      <w:t xml:space="preserve">第 </w:t>
+      <w:t xml:space="preserve">Page </w:t>
     </w:r>
     <w:r>
       <w:rPr>
@@ -3384,16 +3098,6 @@
       </w:rPr>
     </w:r>
     <w:fldSimple w:instr="PAGE"/>
-    <w:r>
-      <w:rPr>
-        <w:rFonts w:ascii="Segoe UI" w:hAnsi="Segoe UI" w:eastAsia="Microsoft JhengHei"/>
-        <w:b w:val="0"/>
-        <w:i w:val="0"/>
-        <w:color w:val="6B7280"/>
-        <w:sz w:val="18"/>
-      </w:rPr>
-      <w:t xml:space="preserve"> 頁 Page</w:t>
-    </w:r>
   </w:p>
 </w:ftr>
 </file>

</xml_diff>

<commit_message>
Merge the quick check into the pre-test revision paper as its first section
ch17-test is now 15 questions / 35 marks: section Q is the 5-question quick check (instant feedback, method + typed number, tick table), followed by Section A (4 MC) and Section B (6 conventional). The standalone ch17-qc part, its data/js and its worksheet are removed; the intro and paper title now tell students to do the quick check first and then work on the rest on their own. The worksheet prints one answer sheet at the top covering every selection question (Q1, Q2, Q5, A1-A4) and Q3/Q4 keep their number boxes.
</commit_message>
<xml_diff>
--- a/docs/worksheets/ch17-test-worksheet.docx
+++ b/docs/worksheets/ch17-test-worksheet.docx
@@ -16,7 +16,7 @@
           <w:color w:val="1F2937"/>
           <w:sz w:val="32"/>
         </w:rPr>
-        <w:t>Chapter 17 Pre-test Revision · Selected Questions</w:t>
+        <w:t>Chapter 17 Pre-test Revision · Quick Check + Selected Questions</w:t>
       </w:r>
     </w:p>
     <w:p>
@@ -33,7 +33,7 @@
           <w:color w:val="6B7280"/>
           <w:sz w:val="20"/>
         </w:rPr>
-        <w:t>S.5 Mathematics · Chapter 17 Pre-test Revision · Total 30 marks</w:t>
+        <w:t>S.5 Mathematics · Chapter 17 Pre-test Revision · Total 35 marks</w:t>
       </w:r>
     </w:p>
     <w:tbl>
@@ -67,7 +67,7 @@
                 <w:color w:val="1F2937"/>
                 <w:sz w:val="20"/>
               </w:rPr>
-              <w:t>Name: ____________ Class: ________ Date: ________ Score: ______ / 30</w:t>
+              <w:t>Name: ____________ Class: ________ Date: ________ Score: ______ / 35</w:t>
             </w:r>
           </w:p>
         </w:tc>
@@ -86,7 +86,7 @@
           <w:color w:val="6B7280"/>
           <w:sz w:val="19"/>
         </w:rPr>
-        <w:t>10 questions, 30 marks in all: Section A has 4 multiple-choice questions (2 marks each, 8 marks) and Section B has 6 conventional questions (22 marks).</w:t>
+        <w:t>15 questions, 35 marks in all.</w:t>
       </w:r>
     </w:p>
     <w:p>
@@ -258,6 +258,441 @@
                 <w:sz w:val="20"/>
               </w:rPr>
               <w:t>D</w:t>
+            </w:r>
+          </w:p>
+        </w:tc>
+      </w:tr>
+      <w:tr>
+        <w:trPr>
+          <w:cantSplit/>
+        </w:trPr>
+        <w:tc>
+          <w:tcPr>
+            <w:tcW w:type="dxa" w:w="1928"/>
+            <w:tcBorders>
+              <w:top w:val="single" w:sz="4" w:color="BFBFBF"/>
+              <w:left w:val="single" w:sz="4" w:color="BFBFBF"/>
+              <w:bottom w:val="single" w:sz="4" w:color="BFBFBF"/>
+              <w:right w:val="single" w:sz="4" w:color="BFBFBF"/>
+            </w:tcBorders>
+          </w:tcPr>
+          <w:p>
+            <w:pPr>
+              <w:keepNext/>
+              <w:spacing w:after="0"/>
+              <w:jc w:val="center"/>
+            </w:pPr>
+            <w:r>
+              <w:rPr>
+                <w:rFonts w:ascii="Segoe UI" w:hAnsi="Segoe UI" w:eastAsia="Microsoft JhengHei"/>
+                <w:b/>
+                <w:i w:val="0"/>
+                <w:color w:val="1F2937"/>
+                <w:sz w:val="20"/>
+              </w:rPr>
+              <w:t>Q1</w:t>
+            </w:r>
+          </w:p>
+        </w:tc>
+        <w:tc>
+          <w:tcPr>
+            <w:tcW w:type="dxa" w:w="2409"/>
+            <w:tcBorders>
+              <w:top w:val="single" w:sz="4" w:color="BFBFBF"/>
+              <w:left w:val="single" w:sz="4" w:color="BFBFBF"/>
+              <w:bottom w:val="single" w:sz="4" w:color="BFBFBF"/>
+              <w:right w:val="single" w:sz="4" w:color="BFBFBF"/>
+            </w:tcBorders>
+          </w:tcPr>
+          <w:p>
+            <w:pPr>
+              <w:keepNext/>
+              <w:spacing w:after="0"/>
+              <w:jc w:val="center"/>
+            </w:pPr>
+            <w:r>
+              <w:rPr>
+                <w:rFonts w:ascii="Segoe UI" w:hAnsi="Segoe UI" w:eastAsia="Microsoft JhengHei"/>
+                <w:b w:val="0"/>
+                <w:i w:val="0"/>
+                <w:color w:val="6B7280"/>
+                <w:sz w:val="22"/>
+              </w:rPr>
+              <w:t>○</w:t>
+            </w:r>
+          </w:p>
+        </w:tc>
+        <w:tc>
+          <w:tcPr>
+            <w:tcW w:type="dxa" w:w="2409"/>
+            <w:tcBorders>
+              <w:top w:val="single" w:sz="4" w:color="BFBFBF"/>
+              <w:left w:val="single" w:sz="4" w:color="BFBFBF"/>
+              <w:bottom w:val="single" w:sz="4" w:color="BFBFBF"/>
+              <w:right w:val="single" w:sz="4" w:color="BFBFBF"/>
+            </w:tcBorders>
+          </w:tcPr>
+          <w:p>
+            <w:pPr>
+              <w:keepNext/>
+              <w:spacing w:after="0"/>
+              <w:jc w:val="center"/>
+            </w:pPr>
+            <w:r>
+              <w:rPr>
+                <w:rFonts w:ascii="Segoe UI" w:hAnsi="Segoe UI" w:eastAsia="Microsoft JhengHei"/>
+                <w:b w:val="0"/>
+                <w:i w:val="0"/>
+                <w:color w:val="6B7280"/>
+                <w:sz w:val="22"/>
+              </w:rPr>
+              <w:t>○</w:t>
+            </w:r>
+          </w:p>
+        </w:tc>
+        <w:tc>
+          <w:tcPr>
+            <w:tcW w:type="dxa" w:w="2409"/>
+            <w:tcBorders>
+              <w:top w:val="single" w:sz="4" w:color="BFBFBF"/>
+              <w:left w:val="single" w:sz="4" w:color="BFBFBF"/>
+              <w:bottom w:val="single" w:sz="4" w:color="BFBFBF"/>
+              <w:right w:val="single" w:sz="4" w:color="BFBFBF"/>
+            </w:tcBorders>
+          </w:tcPr>
+          <w:p>
+            <w:pPr>
+              <w:keepNext/>
+              <w:spacing w:after="0"/>
+              <w:jc w:val="center"/>
+            </w:pPr>
+            <w:r>
+              <w:rPr>
+                <w:rFonts w:ascii="Segoe UI" w:hAnsi="Segoe UI" w:eastAsia="Microsoft JhengHei"/>
+                <w:b w:val="0"/>
+                <w:i w:val="0"/>
+                <w:color w:val="6B7280"/>
+                <w:sz w:val="22"/>
+              </w:rPr>
+              <w:t>○</w:t>
+            </w:r>
+          </w:p>
+        </w:tc>
+        <w:tc>
+          <w:tcPr>
+            <w:tcW w:type="dxa" w:w="2409"/>
+            <w:tcBorders>
+              <w:top w:val="single" w:sz="4" w:color="BFBFBF"/>
+              <w:left w:val="single" w:sz="4" w:color="BFBFBF"/>
+              <w:bottom w:val="single" w:sz="4" w:color="BFBFBF"/>
+              <w:right w:val="single" w:sz="4" w:color="BFBFBF"/>
+            </w:tcBorders>
+          </w:tcPr>
+          <w:p>
+            <w:pPr>
+              <w:keepNext/>
+              <w:spacing w:after="0"/>
+              <w:jc w:val="center"/>
+            </w:pPr>
+            <w:r>
+              <w:rPr>
+                <w:rFonts w:ascii="Segoe UI" w:hAnsi="Segoe UI" w:eastAsia="Microsoft JhengHei"/>
+                <w:b w:val="0"/>
+                <w:i w:val="0"/>
+                <w:color w:val="6B7280"/>
+                <w:sz w:val="22"/>
+              </w:rPr>
+              <w:t>○</w:t>
+            </w:r>
+          </w:p>
+        </w:tc>
+      </w:tr>
+      <w:tr>
+        <w:trPr>
+          <w:cantSplit/>
+        </w:trPr>
+        <w:tc>
+          <w:tcPr>
+            <w:tcW w:type="dxa" w:w="1928"/>
+            <w:tcBorders>
+              <w:top w:val="single" w:sz="4" w:color="BFBFBF"/>
+              <w:left w:val="single" w:sz="4" w:color="BFBFBF"/>
+              <w:bottom w:val="single" w:sz="4" w:color="BFBFBF"/>
+              <w:right w:val="single" w:sz="4" w:color="BFBFBF"/>
+            </w:tcBorders>
+          </w:tcPr>
+          <w:p>
+            <w:pPr>
+              <w:keepNext/>
+              <w:spacing w:after="0"/>
+              <w:jc w:val="center"/>
+            </w:pPr>
+            <w:r>
+              <w:rPr>
+                <w:rFonts w:ascii="Segoe UI" w:hAnsi="Segoe UI" w:eastAsia="Microsoft JhengHei"/>
+                <w:b/>
+                <w:i w:val="0"/>
+                <w:color w:val="1F2937"/>
+                <w:sz w:val="20"/>
+              </w:rPr>
+              <w:t>Q2</w:t>
+            </w:r>
+          </w:p>
+        </w:tc>
+        <w:tc>
+          <w:tcPr>
+            <w:tcW w:type="dxa" w:w="2409"/>
+            <w:tcBorders>
+              <w:top w:val="single" w:sz="4" w:color="BFBFBF"/>
+              <w:left w:val="single" w:sz="4" w:color="BFBFBF"/>
+              <w:bottom w:val="single" w:sz="4" w:color="BFBFBF"/>
+              <w:right w:val="single" w:sz="4" w:color="BFBFBF"/>
+            </w:tcBorders>
+          </w:tcPr>
+          <w:p>
+            <w:pPr>
+              <w:keepNext/>
+              <w:spacing w:after="0"/>
+              <w:jc w:val="center"/>
+            </w:pPr>
+            <w:r>
+              <w:rPr>
+                <w:rFonts w:ascii="Segoe UI" w:hAnsi="Segoe UI" w:eastAsia="Microsoft JhengHei"/>
+                <w:b w:val="0"/>
+                <w:i w:val="0"/>
+                <w:color w:val="6B7280"/>
+                <w:sz w:val="22"/>
+              </w:rPr>
+              <w:t>○</w:t>
+            </w:r>
+          </w:p>
+        </w:tc>
+        <w:tc>
+          <w:tcPr>
+            <w:tcW w:type="dxa" w:w="2409"/>
+            <w:tcBorders>
+              <w:top w:val="single" w:sz="4" w:color="BFBFBF"/>
+              <w:left w:val="single" w:sz="4" w:color="BFBFBF"/>
+              <w:bottom w:val="single" w:sz="4" w:color="BFBFBF"/>
+              <w:right w:val="single" w:sz="4" w:color="BFBFBF"/>
+            </w:tcBorders>
+          </w:tcPr>
+          <w:p>
+            <w:pPr>
+              <w:keepNext/>
+              <w:spacing w:after="0"/>
+              <w:jc w:val="center"/>
+            </w:pPr>
+            <w:r>
+              <w:rPr>
+                <w:rFonts w:ascii="Segoe UI" w:hAnsi="Segoe UI" w:eastAsia="Microsoft JhengHei"/>
+                <w:b w:val="0"/>
+                <w:i w:val="0"/>
+                <w:color w:val="6B7280"/>
+                <w:sz w:val="22"/>
+              </w:rPr>
+              <w:t>○</w:t>
+            </w:r>
+          </w:p>
+        </w:tc>
+        <w:tc>
+          <w:tcPr>
+            <w:tcW w:type="dxa" w:w="2409"/>
+            <w:tcBorders>
+              <w:top w:val="single" w:sz="4" w:color="BFBFBF"/>
+              <w:left w:val="single" w:sz="4" w:color="BFBFBF"/>
+              <w:bottom w:val="single" w:sz="4" w:color="BFBFBF"/>
+              <w:right w:val="single" w:sz="4" w:color="BFBFBF"/>
+            </w:tcBorders>
+          </w:tcPr>
+          <w:p>
+            <w:pPr>
+              <w:keepNext/>
+              <w:spacing w:after="0"/>
+              <w:jc w:val="center"/>
+            </w:pPr>
+            <w:r>
+              <w:rPr>
+                <w:rFonts w:ascii="Segoe UI" w:hAnsi="Segoe UI" w:eastAsia="Microsoft JhengHei"/>
+                <w:b w:val="0"/>
+                <w:i w:val="0"/>
+                <w:color w:val="6B7280"/>
+                <w:sz w:val="22"/>
+              </w:rPr>
+              <w:t>○</w:t>
+            </w:r>
+          </w:p>
+        </w:tc>
+        <w:tc>
+          <w:tcPr>
+            <w:tcW w:type="dxa" w:w="2409"/>
+            <w:tcBorders>
+              <w:top w:val="single" w:sz="4" w:color="BFBFBF"/>
+              <w:left w:val="single" w:sz="4" w:color="BFBFBF"/>
+              <w:bottom w:val="single" w:sz="4" w:color="BFBFBF"/>
+              <w:right w:val="single" w:sz="4" w:color="BFBFBF"/>
+            </w:tcBorders>
+          </w:tcPr>
+          <w:p>
+            <w:pPr>
+              <w:keepNext/>
+              <w:spacing w:after="0"/>
+              <w:jc w:val="center"/>
+            </w:pPr>
+            <w:r>
+              <w:rPr>
+                <w:rFonts w:ascii="Segoe UI" w:hAnsi="Segoe UI" w:eastAsia="Microsoft JhengHei"/>
+                <w:b w:val="0"/>
+                <w:i w:val="0"/>
+                <w:color w:val="6B7280"/>
+                <w:sz w:val="22"/>
+              </w:rPr>
+              <w:t>○</w:t>
+            </w:r>
+          </w:p>
+        </w:tc>
+      </w:tr>
+      <w:tr>
+        <w:trPr>
+          <w:cantSplit/>
+        </w:trPr>
+        <w:tc>
+          <w:tcPr>
+            <w:tcW w:type="dxa" w:w="1928"/>
+            <w:tcBorders>
+              <w:top w:val="single" w:sz="4" w:color="BFBFBF"/>
+              <w:left w:val="single" w:sz="4" w:color="BFBFBF"/>
+              <w:bottom w:val="single" w:sz="4" w:color="BFBFBF"/>
+              <w:right w:val="single" w:sz="4" w:color="BFBFBF"/>
+            </w:tcBorders>
+          </w:tcPr>
+          <w:p>
+            <w:pPr>
+              <w:keepNext/>
+              <w:spacing w:after="0"/>
+              <w:jc w:val="center"/>
+            </w:pPr>
+            <w:r>
+              <w:rPr>
+                <w:rFonts w:ascii="Segoe UI" w:hAnsi="Segoe UI" w:eastAsia="Microsoft JhengHei"/>
+                <w:b/>
+                <w:i w:val="0"/>
+                <w:color w:val="1F2937"/>
+                <w:sz w:val="20"/>
+              </w:rPr>
+              <w:t>Q5</w:t>
+            </w:r>
+          </w:p>
+        </w:tc>
+        <w:tc>
+          <w:tcPr>
+            <w:tcW w:type="dxa" w:w="2409"/>
+            <w:tcBorders>
+              <w:top w:val="single" w:sz="4" w:color="BFBFBF"/>
+              <w:left w:val="single" w:sz="4" w:color="BFBFBF"/>
+              <w:bottom w:val="single" w:sz="4" w:color="BFBFBF"/>
+              <w:right w:val="single" w:sz="4" w:color="BFBFBF"/>
+            </w:tcBorders>
+          </w:tcPr>
+          <w:p>
+            <w:pPr>
+              <w:keepNext/>
+              <w:spacing w:after="0"/>
+              <w:jc w:val="center"/>
+            </w:pPr>
+            <w:r>
+              <w:rPr>
+                <w:rFonts w:ascii="Segoe UI" w:hAnsi="Segoe UI" w:eastAsia="Microsoft JhengHei"/>
+                <w:b w:val="0"/>
+                <w:i w:val="0"/>
+                <w:color w:val="6B7280"/>
+                <w:sz w:val="22"/>
+              </w:rPr>
+              <w:t>☐</w:t>
+            </w:r>
+          </w:p>
+        </w:tc>
+        <w:tc>
+          <w:tcPr>
+            <w:tcW w:type="dxa" w:w="2409"/>
+            <w:tcBorders>
+              <w:top w:val="single" w:sz="4" w:color="BFBFBF"/>
+              <w:left w:val="single" w:sz="4" w:color="BFBFBF"/>
+              <w:bottom w:val="single" w:sz="4" w:color="BFBFBF"/>
+              <w:right w:val="single" w:sz="4" w:color="BFBFBF"/>
+            </w:tcBorders>
+          </w:tcPr>
+          <w:p>
+            <w:pPr>
+              <w:keepNext/>
+              <w:spacing w:after="0"/>
+              <w:jc w:val="center"/>
+            </w:pPr>
+            <w:r>
+              <w:rPr>
+                <w:rFonts w:ascii="Segoe UI" w:hAnsi="Segoe UI" w:eastAsia="Microsoft JhengHei"/>
+                <w:b w:val="0"/>
+                <w:i w:val="0"/>
+                <w:color w:val="6B7280"/>
+                <w:sz w:val="22"/>
+              </w:rPr>
+              <w:t>☐</w:t>
+            </w:r>
+          </w:p>
+        </w:tc>
+        <w:tc>
+          <w:tcPr>
+            <w:tcW w:type="dxa" w:w="2409"/>
+            <w:tcBorders>
+              <w:top w:val="single" w:sz="4" w:color="BFBFBF"/>
+              <w:left w:val="single" w:sz="4" w:color="BFBFBF"/>
+              <w:bottom w:val="single" w:sz="4" w:color="BFBFBF"/>
+              <w:right w:val="single" w:sz="4" w:color="BFBFBF"/>
+            </w:tcBorders>
+          </w:tcPr>
+          <w:p>
+            <w:pPr>
+              <w:keepNext/>
+              <w:spacing w:after="0"/>
+              <w:jc w:val="center"/>
+            </w:pPr>
+            <w:r>
+              <w:rPr>
+                <w:rFonts w:ascii="Segoe UI" w:hAnsi="Segoe UI" w:eastAsia="Microsoft JhengHei"/>
+                <w:b w:val="0"/>
+                <w:i w:val="0"/>
+                <w:color w:val="6B7280"/>
+                <w:sz w:val="22"/>
+              </w:rPr>
+              <w:t>☐</w:t>
+            </w:r>
+          </w:p>
+        </w:tc>
+        <w:tc>
+          <w:tcPr>
+            <w:tcW w:type="dxa" w:w="2409"/>
+            <w:tcBorders>
+              <w:top w:val="single" w:sz="4" w:color="BFBFBF"/>
+              <w:left w:val="single" w:sz="4" w:color="BFBFBF"/>
+              <w:bottom w:val="single" w:sz="4" w:color="BFBFBF"/>
+              <w:right w:val="single" w:sz="4" w:color="BFBFBF"/>
+            </w:tcBorders>
+          </w:tcPr>
+          <w:p>
+            <w:pPr>
+              <w:keepNext/>
+              <w:spacing w:after="0"/>
+              <w:jc w:val="center"/>
+            </w:pPr>
+            <w:r>
+              <w:rPr>
+                <w:rFonts w:ascii="Segoe UI" w:hAnsi="Segoe UI" w:eastAsia="Microsoft JhengHei"/>
+                <w:b w:val="0"/>
+                <w:i w:val="0"/>
+                <w:color w:val="6B7280"/>
+                <w:sz w:val="22"/>
+              </w:rPr>
+              <w:t>☐</w:t>
             </w:r>
           </w:p>
         </w:tc>
@@ -838,6 +1273,1326 @@
                 <w:sz w:val="22"/>
               </w:rPr>
               <w:t>○</w:t>
+            </w:r>
+          </w:p>
+        </w:tc>
+      </w:tr>
+    </w:tbl>
+    <w:p>
+      <w:pPr>
+        <w:keepNext w:val="0"/>
+        <w:spacing w:after="0" w:before="0" w:line="300" w:lineRule="auto"/>
+      </w:pPr>
+    </w:p>
+    <w:p>
+      <w:pPr>
+        <w:keepNext/>
+        <w:spacing w:after="80" w:before="160" w:line="300" w:lineRule="auto"/>
+      </w:pPr>
+      <w:r>
+        <w:rPr>
+          <w:rFonts w:ascii="Segoe UI" w:hAnsi="Segoe UI" w:eastAsia="Microsoft JhengHei"/>
+          <w:b/>
+          <w:i w:val="0"/>
+          <w:color w:val="1D4ED8"/>
+          <w:sz w:val="25"/>
+        </w:rPr>
+        <w:t>Quick check · 5 questions (1 mark each, 5 marks in all)</w:t>
+      </w:r>
+      <w:r>
+        <w:rPr>
+          <w:rFonts w:ascii="Segoe UI" w:hAnsi="Segoe UI" w:eastAsia="Microsoft JhengHei"/>
+          <w:b w:val="0"/>
+          <w:i w:val="0"/>
+          <w:color w:val="6B7280"/>
+          <w:sz w:val="20"/>
+        </w:rPr>
+        <w:t xml:space="preserve"> (5 marks)</w:t>
+      </w:r>
+    </w:p>
+    <w:p>
+      <w:pPr>
+        <w:keepNext/>
+        <w:spacing w:after="20" w:before="120" w:line="300" w:lineRule="auto"/>
+      </w:pPr>
+      <w:r>
+        <w:rPr>
+          <w:rFonts w:ascii="Segoe UI" w:hAnsi="Segoe UI" w:eastAsia="Microsoft JhengHei"/>
+          <w:b/>
+          <w:i w:val="0"/>
+          <w:color w:val="1F2937"/>
+          <w:sz w:val="22"/>
+        </w:rPr>
+        <w:t xml:space="preserve">Q1 </w:t>
+      </w:r>
+      <w:r>
+        <w:rPr>
+          <w:rFonts w:ascii="Segoe UI" w:hAnsi="Segoe UI" w:eastAsia="Microsoft JhengHei"/>
+          <w:b w:val="0"/>
+          <w:i w:val="0"/>
+          <w:color w:val="6B7280"/>
+          <w:sz w:val="19"/>
+        </w:rPr>
+        <w:t>[1 mark]</w:t>
+      </w:r>
+    </w:p>
+    <w:p>
+      <w:pPr>
+        <w:keepNext/>
+        <w:spacing w:after="40" w:before="0" w:line="300" w:lineRule="auto"/>
+        <w:ind w:left="340"/>
+      </w:pPr>
+      <w:r>
+        <w:rPr>
+          <w:rFonts w:ascii="Segoe UI" w:hAnsi="Segoe UI" w:eastAsia="Microsoft JhengHei"/>
+          <w:b w:val="0"/>
+          <w:i w:val="0"/>
+          <w:color w:val="1F2937"/>
+          <w:sz w:val="21"/>
+        </w:rPr>
+        <w:t>From a class of 30 students, 3 students are chosen to be the class monitor, the vice monitor and the treasurer. How many ways can this be done?</w:t>
+      </w:r>
+    </w:p>
+    <w:tbl>
+      <w:tblPr>
+        <w:tblW w:type="auto" w:w="0"/>
+        <w:tblLook w:firstColumn="1" w:firstRow="1" w:lastColumn="0" w:lastRow="0" w:noHBand="0" w:noVBand="1" w:val="04A0"/>
+      </w:tblPr>
+      <w:tblGrid>
+        <w:gridCol w:w="4819"/>
+        <w:gridCol w:w="4819"/>
+      </w:tblGrid>
+      <w:tr>
+        <w:tc>
+          <w:tcPr>
+            <w:tcW w:type="dxa" w:w="4819"/>
+            <w:tcBorders>
+              <w:top w:val="nil"/>
+              <w:left w:val="nil"/>
+              <w:bottom w:val="nil"/>
+              <w:right w:val="nil"/>
+            </w:tcBorders>
+          </w:tcPr>
+          <w:p>
+            <w:pPr>
+              <w:spacing w:after="20"/>
+              <w:ind w:left="340"/>
+            </w:pPr>
+            <w:r>
+              <w:rPr>
+                <w:rFonts w:ascii="Segoe UI" w:hAnsi="Segoe UI" w:eastAsia="Microsoft JhengHei"/>
+                <w:b w:val="0"/>
+                <w:i w:val="0"/>
+                <w:color w:val="1F2937"/>
+                <w:sz w:val="21"/>
+              </w:rPr>
+              <w:t>(A) C³0₃</w:t>
+            </w:r>
+          </w:p>
+        </w:tc>
+        <w:tc>
+          <w:tcPr>
+            <w:tcW w:type="dxa" w:w="4819"/>
+            <w:tcBorders>
+              <w:top w:val="nil"/>
+              <w:left w:val="nil"/>
+              <w:bottom w:val="nil"/>
+              <w:right w:val="nil"/>
+            </w:tcBorders>
+          </w:tcPr>
+          <w:p>
+            <w:pPr>
+              <w:spacing w:after="20"/>
+              <w:ind w:left="340"/>
+            </w:pPr>
+            <w:r>
+              <w:rPr>
+                <w:rFonts w:ascii="Segoe UI" w:hAnsi="Segoe UI" w:eastAsia="Microsoft JhengHei"/>
+                <w:b w:val="0"/>
+                <w:i w:val="0"/>
+                <w:color w:val="1F2937"/>
+                <w:sz w:val="21"/>
+              </w:rPr>
+              <w:t>(B) P³0₃</w:t>
+            </w:r>
+          </w:p>
+        </w:tc>
+      </w:tr>
+      <w:tr>
+        <w:tc>
+          <w:tcPr>
+            <w:tcW w:type="dxa" w:w="4819"/>
+            <w:tcBorders>
+              <w:top w:val="nil"/>
+              <w:left w:val="nil"/>
+              <w:bottom w:val="nil"/>
+              <w:right w:val="nil"/>
+            </w:tcBorders>
+          </w:tcPr>
+          <w:p>
+            <w:pPr>
+              <w:spacing w:after="20"/>
+              <w:ind w:left="340"/>
+            </w:pPr>
+            <w:r>
+              <w:rPr>
+                <w:rFonts w:ascii="Segoe UI" w:hAnsi="Segoe UI" w:eastAsia="Microsoft JhengHei"/>
+                <w:b w:val="0"/>
+                <w:i w:val="0"/>
+                <w:color w:val="1F2937"/>
+                <w:sz w:val="21"/>
+              </w:rPr>
+              <w:t>(C) 30!</w:t>
+            </w:r>
+          </w:p>
+        </w:tc>
+        <w:tc>
+          <w:tcPr>
+            <w:tcW w:type="dxa" w:w="4819"/>
+            <w:tcBorders>
+              <w:top w:val="nil"/>
+              <w:left w:val="nil"/>
+              <w:bottom w:val="nil"/>
+              <w:right w:val="nil"/>
+            </w:tcBorders>
+          </w:tcPr>
+          <w:p>
+            <w:pPr>
+              <w:spacing w:after="20"/>
+              <w:ind w:left="340"/>
+            </w:pPr>
+            <w:r>
+              <w:rPr>
+                <w:rFonts w:ascii="Segoe UI" w:hAnsi="Segoe UI" w:eastAsia="Microsoft JhengHei"/>
+                <w:b w:val="0"/>
+                <w:i w:val="0"/>
+                <w:color w:val="1F2937"/>
+                <w:sz w:val="21"/>
+              </w:rPr>
+              <w:t>(D) 3!</w:t>
+            </w:r>
+          </w:p>
+        </w:tc>
+      </w:tr>
+    </w:tbl>
+    <w:p>
+      <w:pPr>
+        <w:keepNext w:val="0"/>
+        <w:spacing w:after="0" w:before="0" w:line="300" w:lineRule="auto"/>
+      </w:pPr>
+    </w:p>
+    <w:p>
+      <w:pPr>
+        <w:keepNext/>
+        <w:spacing w:after="20" w:before="120" w:line="300" w:lineRule="auto"/>
+      </w:pPr>
+      <w:r>
+        <w:rPr>
+          <w:rFonts w:ascii="Segoe UI" w:hAnsi="Segoe UI" w:eastAsia="Microsoft JhengHei"/>
+          <w:b/>
+          <w:i w:val="0"/>
+          <w:color w:val="1F2937"/>
+          <w:sz w:val="22"/>
+        </w:rPr>
+        <w:t xml:space="preserve">Q2 </w:t>
+      </w:r>
+      <w:r>
+        <w:rPr>
+          <w:rFonts w:ascii="Segoe UI" w:hAnsi="Segoe UI" w:eastAsia="Microsoft JhengHei"/>
+          <w:b w:val="0"/>
+          <w:i w:val="0"/>
+          <w:color w:val="6B7280"/>
+          <w:sz w:val="19"/>
+        </w:rPr>
+        <w:t>[1 mark]</w:t>
+      </w:r>
+    </w:p>
+    <w:p>
+      <w:pPr>
+        <w:keepNext/>
+        <w:spacing w:after="40" w:before="0" w:line="300" w:lineRule="auto"/>
+        <w:ind w:left="340"/>
+      </w:pPr>
+      <w:r>
+        <w:rPr>
+          <w:rFonts w:ascii="Segoe UI" w:hAnsi="Segoe UI" w:eastAsia="Microsoft JhengHei"/>
+          <w:b w:val="0"/>
+          <w:i w:val="0"/>
+          <w:color w:val="1F2937"/>
+          <w:sz w:val="21"/>
+        </w:rPr>
+        <w:t>From a class of 30 students, 3 students are chosen to form the Mathematics board display team. How many ways can this be done?</w:t>
+      </w:r>
+    </w:p>
+    <w:tbl>
+      <w:tblPr>
+        <w:tblW w:type="auto" w:w="0"/>
+        <w:tblLook w:firstColumn="1" w:firstRow="1" w:lastColumn="0" w:lastRow="0" w:noHBand="0" w:noVBand="1" w:val="04A0"/>
+      </w:tblPr>
+      <w:tblGrid>
+        <w:gridCol w:w="4819"/>
+        <w:gridCol w:w="4819"/>
+      </w:tblGrid>
+      <w:tr>
+        <w:tc>
+          <w:tcPr>
+            <w:tcW w:type="dxa" w:w="4819"/>
+            <w:tcBorders>
+              <w:top w:val="nil"/>
+              <w:left w:val="nil"/>
+              <w:bottom w:val="nil"/>
+              <w:right w:val="nil"/>
+            </w:tcBorders>
+          </w:tcPr>
+          <w:p>
+            <w:pPr>
+              <w:spacing w:after="20"/>
+              <w:ind w:left="340"/>
+            </w:pPr>
+            <w:r>
+              <w:rPr>
+                <w:rFonts w:ascii="Segoe UI" w:hAnsi="Segoe UI" w:eastAsia="Microsoft JhengHei"/>
+                <w:b w:val="0"/>
+                <w:i w:val="0"/>
+                <w:color w:val="1F2937"/>
+                <w:sz w:val="21"/>
+              </w:rPr>
+              <w:t>(A) C³0₃</w:t>
+            </w:r>
+          </w:p>
+        </w:tc>
+        <w:tc>
+          <w:tcPr>
+            <w:tcW w:type="dxa" w:w="4819"/>
+            <w:tcBorders>
+              <w:top w:val="nil"/>
+              <w:left w:val="nil"/>
+              <w:bottom w:val="nil"/>
+              <w:right w:val="nil"/>
+            </w:tcBorders>
+          </w:tcPr>
+          <w:p>
+            <w:pPr>
+              <w:spacing w:after="20"/>
+              <w:ind w:left="340"/>
+            </w:pPr>
+            <w:r>
+              <w:rPr>
+                <w:rFonts w:ascii="Segoe UI" w:hAnsi="Segoe UI" w:eastAsia="Microsoft JhengHei"/>
+                <w:b w:val="0"/>
+                <w:i w:val="0"/>
+                <w:color w:val="1F2937"/>
+                <w:sz w:val="21"/>
+              </w:rPr>
+              <w:t>(B) P³0₃</w:t>
+            </w:r>
+          </w:p>
+        </w:tc>
+      </w:tr>
+      <w:tr>
+        <w:tc>
+          <w:tcPr>
+            <w:tcW w:type="dxa" w:w="4819"/>
+            <w:tcBorders>
+              <w:top w:val="nil"/>
+              <w:left w:val="nil"/>
+              <w:bottom w:val="nil"/>
+              <w:right w:val="nil"/>
+            </w:tcBorders>
+          </w:tcPr>
+          <w:p>
+            <w:pPr>
+              <w:spacing w:after="20"/>
+              <w:ind w:left="340"/>
+            </w:pPr>
+            <w:r>
+              <w:rPr>
+                <w:rFonts w:ascii="Segoe UI" w:hAnsi="Segoe UI" w:eastAsia="Microsoft JhengHei"/>
+                <w:b w:val="0"/>
+                <w:i w:val="0"/>
+                <w:color w:val="1F2937"/>
+                <w:sz w:val="21"/>
+              </w:rPr>
+              <w:t>(C) 30!</w:t>
+            </w:r>
+          </w:p>
+        </w:tc>
+        <w:tc>
+          <w:tcPr>
+            <w:tcW w:type="dxa" w:w="4819"/>
+            <w:tcBorders>
+              <w:top w:val="nil"/>
+              <w:left w:val="nil"/>
+              <w:bottom w:val="nil"/>
+              <w:right w:val="nil"/>
+            </w:tcBorders>
+          </w:tcPr>
+          <w:p>
+            <w:pPr>
+              <w:spacing w:after="20"/>
+              <w:ind w:left="340"/>
+            </w:pPr>
+            <w:r>
+              <w:rPr>
+                <w:rFonts w:ascii="Segoe UI" w:hAnsi="Segoe UI" w:eastAsia="Microsoft JhengHei"/>
+                <w:b w:val="0"/>
+                <w:i w:val="0"/>
+                <w:color w:val="1F2937"/>
+                <w:sz w:val="21"/>
+              </w:rPr>
+              <w:t>(D) 3!</w:t>
+            </w:r>
+          </w:p>
+        </w:tc>
+      </w:tr>
+    </w:tbl>
+    <w:p>
+      <w:pPr>
+        <w:keepNext w:val="0"/>
+        <w:spacing w:after="0" w:before="0" w:line="300" w:lineRule="auto"/>
+      </w:pPr>
+    </w:p>
+    <w:p>
+      <w:pPr>
+        <w:keepNext/>
+        <w:spacing w:after="20" w:before="120" w:line="300" w:lineRule="auto"/>
+      </w:pPr>
+      <w:r>
+        <w:rPr>
+          <w:rFonts w:ascii="Segoe UI" w:hAnsi="Segoe UI" w:eastAsia="Microsoft JhengHei"/>
+          <w:b/>
+          <w:i w:val="0"/>
+          <w:color w:val="1F2937"/>
+          <w:sz w:val="22"/>
+        </w:rPr>
+        <w:t xml:space="preserve">Q3 </w:t>
+      </w:r>
+      <w:r>
+        <w:rPr>
+          <w:rFonts w:ascii="Segoe UI" w:hAnsi="Segoe UI" w:eastAsia="Microsoft JhengHei"/>
+          <w:b w:val="0"/>
+          <w:i w:val="0"/>
+          <w:color w:val="6B7280"/>
+          <w:sz w:val="19"/>
+        </w:rPr>
+        <w:t>[1 mark]</w:t>
+      </w:r>
+    </w:p>
+    <w:p>
+      <w:pPr>
+        <w:keepNext/>
+        <w:spacing w:after="40" w:before="0" w:line="300" w:lineRule="auto"/>
+        <w:ind w:left="340"/>
+      </w:pPr>
+      <w:r>
+        <w:rPr>
+          <w:rFonts w:ascii="Segoe UI" w:hAnsi="Segoe UI" w:eastAsia="Microsoft JhengHei"/>
+          <w:b w:val="0"/>
+          <w:i w:val="0"/>
+          <w:color w:val="1F2937"/>
+          <w:sz w:val="21"/>
+        </w:rPr>
+        <w:t>Five boys and three girls stand in a row for a class photo. Two particular boys must sit together. Which method should be used, and how many arrangements are possible?</w:t>
+      </w:r>
+    </w:p>
+    <w:tbl>
+      <w:tblPr>
+        <w:tblW w:type="auto" w:w="0"/>
+        <w:tblLook w:firstColumn="1" w:firstRow="1" w:lastColumn="0" w:lastRow="0" w:noHBand="0" w:noVBand="1" w:val="04A0"/>
+      </w:tblPr>
+      <w:tblGrid>
+        <w:gridCol w:w="4819"/>
+        <w:gridCol w:w="4819"/>
+      </w:tblGrid>
+      <w:tr>
+        <w:tc>
+          <w:tcPr>
+            <w:tcW w:type="dxa" w:w="4819"/>
+            <w:tcBorders>
+              <w:top w:val="nil"/>
+              <w:left w:val="nil"/>
+              <w:bottom w:val="nil"/>
+              <w:right w:val="nil"/>
+            </w:tcBorders>
+          </w:tcPr>
+          <w:p>
+            <w:pPr>
+              <w:spacing w:after="20"/>
+              <w:ind w:left="340"/>
+            </w:pPr>
+            <w:r>
+              <w:rPr>
+                <w:rFonts w:ascii="Segoe UI" w:hAnsi="Segoe UI" w:eastAsia="Microsoft JhengHei"/>
+                <w:b w:val="0"/>
+                <w:i w:val="0"/>
+                <w:color w:val="1F2937"/>
+                <w:sz w:val="21"/>
+              </w:rPr>
+              <w:t>(A) Slot-in</w:t>
+            </w:r>
+          </w:p>
+        </w:tc>
+        <w:tc>
+          <w:tcPr>
+            <w:tcW w:type="dxa" w:w="4819"/>
+            <w:tcBorders>
+              <w:top w:val="nil"/>
+              <w:left w:val="nil"/>
+              <w:bottom w:val="nil"/>
+              <w:right w:val="nil"/>
+            </w:tcBorders>
+          </w:tcPr>
+          <w:p>
+            <w:pPr>
+              <w:spacing w:after="20"/>
+              <w:ind w:left="340"/>
+            </w:pPr>
+            <w:r>
+              <w:rPr>
+                <w:rFonts w:ascii="Segoe UI" w:hAnsi="Segoe UI" w:eastAsia="Microsoft JhengHei"/>
+                <w:b w:val="0"/>
+                <w:i w:val="0"/>
+                <w:color w:val="1F2937"/>
+                <w:sz w:val="21"/>
+              </w:rPr>
+              <w:t>(B) Tie-up</w:t>
+            </w:r>
+          </w:p>
+        </w:tc>
+      </w:tr>
+    </w:tbl>
+    <w:tbl>
+      <w:tblPr>
+        <w:tblW w:type="auto" w:w="0"/>
+        <w:tblLook w:firstColumn="1" w:firstRow="1" w:lastColumn="0" w:lastRow="0" w:noHBand="0" w:noVBand="1" w:val="04A0"/>
+      </w:tblPr>
+      <w:tblGrid>
+        <w:gridCol w:w="9638"/>
+      </w:tblGrid>
+      <w:tr>
+        <w:tc>
+          <w:tcPr>
+            <w:tcW w:type="dxa" w:w="9638"/>
+            <w:tcBorders>
+              <w:top w:val="single" w:sz="4" w:color="BFBFBF"/>
+              <w:left w:val="single" w:sz="4" w:color="BFBFBF"/>
+              <w:bottom w:val="single" w:sz="4" w:color="BFBFBF"/>
+              <w:right w:val="single" w:sz="4" w:color="BFBFBF"/>
+            </w:tcBorders>
+          </w:tcPr>
+          <w:p>
+            <w:pPr>
+              <w:spacing w:after="40"/>
+              <w:ind w:left="340"/>
+            </w:pPr>
+            <w:r>
+              <w:rPr>
+                <w:rFonts w:ascii="Segoe UI" w:hAnsi="Segoe UI" w:eastAsia="Microsoft JhengHei"/>
+                <w:b/>
+                <w:i w:val="0"/>
+                <w:color w:val="1F2937"/>
+                <w:sz w:val="21"/>
+              </w:rPr>
+              <w:t xml:space="preserve">Number of arrangements: </w:t>
+            </w:r>
+            <w:r>
+              <w:rPr>
+                <w:rFonts w:ascii="Segoe UI" w:hAnsi="Segoe UI" w:eastAsia="Microsoft JhengHei"/>
+                <w:b w:val="0"/>
+                <w:i w:val="0"/>
+                <w:color w:val="6B7280"/>
+                <w:sz w:val="21"/>
+              </w:rPr>
+              <w:t>____________________________</w:t>
+            </w:r>
+          </w:p>
+        </w:tc>
+      </w:tr>
+    </w:tbl>
+    <w:p>
+      <w:pPr>
+        <w:keepNext w:val="0"/>
+        <w:spacing w:after="0" w:before="0" w:line="300" w:lineRule="auto"/>
+      </w:pPr>
+    </w:p>
+    <w:p>
+      <w:pPr>
+        <w:keepNext/>
+        <w:spacing w:after="20" w:before="120" w:line="300" w:lineRule="auto"/>
+      </w:pPr>
+      <w:r>
+        <w:rPr>
+          <w:rFonts w:ascii="Segoe UI" w:hAnsi="Segoe UI" w:eastAsia="Microsoft JhengHei"/>
+          <w:b/>
+          <w:i w:val="0"/>
+          <w:color w:val="1F2937"/>
+          <w:sz w:val="22"/>
+        </w:rPr>
+        <w:t xml:space="preserve">Q4 </w:t>
+      </w:r>
+      <w:r>
+        <w:rPr>
+          <w:rFonts w:ascii="Segoe UI" w:hAnsi="Segoe UI" w:eastAsia="Microsoft JhengHei"/>
+          <w:b w:val="0"/>
+          <w:i w:val="0"/>
+          <w:color w:val="6B7280"/>
+          <w:sz w:val="19"/>
+        </w:rPr>
+        <w:t>[1 mark]</w:t>
+      </w:r>
+    </w:p>
+    <w:p>
+      <w:pPr>
+        <w:keepNext/>
+        <w:spacing w:after="40" w:before="0" w:line="300" w:lineRule="auto"/>
+        <w:ind w:left="340"/>
+      </w:pPr>
+      <w:r>
+        <w:rPr>
+          <w:rFonts w:ascii="Segoe UI" w:hAnsi="Segoe UI" w:eastAsia="Microsoft JhengHei"/>
+          <w:b w:val="0"/>
+          <w:i w:val="0"/>
+          <w:color w:val="1F2937"/>
+          <w:sz w:val="21"/>
+        </w:rPr>
+        <w:t>Five boys and three girls stand in a row for a class photo. No two girls may sit together. Which method should be used, and how many arrangements are possible?</w:t>
+      </w:r>
+    </w:p>
+    <w:tbl>
+      <w:tblPr>
+        <w:tblW w:type="auto" w:w="0"/>
+        <w:tblLook w:firstColumn="1" w:firstRow="1" w:lastColumn="0" w:lastRow="0" w:noHBand="0" w:noVBand="1" w:val="04A0"/>
+      </w:tblPr>
+      <w:tblGrid>
+        <w:gridCol w:w="4819"/>
+        <w:gridCol w:w="4819"/>
+      </w:tblGrid>
+      <w:tr>
+        <w:tc>
+          <w:tcPr>
+            <w:tcW w:type="dxa" w:w="4819"/>
+            <w:tcBorders>
+              <w:top w:val="nil"/>
+              <w:left w:val="nil"/>
+              <w:bottom w:val="nil"/>
+              <w:right w:val="nil"/>
+            </w:tcBorders>
+          </w:tcPr>
+          <w:p>
+            <w:pPr>
+              <w:spacing w:after="20"/>
+              <w:ind w:left="340"/>
+            </w:pPr>
+            <w:r>
+              <w:rPr>
+                <w:rFonts w:ascii="Segoe UI" w:hAnsi="Segoe UI" w:eastAsia="Microsoft JhengHei"/>
+                <w:b w:val="0"/>
+                <w:i w:val="0"/>
+                <w:color w:val="1F2937"/>
+                <w:sz w:val="21"/>
+              </w:rPr>
+              <w:t>(A) Slot-in</w:t>
+            </w:r>
+          </w:p>
+        </w:tc>
+        <w:tc>
+          <w:tcPr>
+            <w:tcW w:type="dxa" w:w="4819"/>
+            <w:tcBorders>
+              <w:top w:val="nil"/>
+              <w:left w:val="nil"/>
+              <w:bottom w:val="nil"/>
+              <w:right w:val="nil"/>
+            </w:tcBorders>
+          </w:tcPr>
+          <w:p>
+            <w:pPr>
+              <w:spacing w:after="20"/>
+              <w:ind w:left="340"/>
+            </w:pPr>
+            <w:r>
+              <w:rPr>
+                <w:rFonts w:ascii="Segoe UI" w:hAnsi="Segoe UI" w:eastAsia="Microsoft JhengHei"/>
+                <w:b w:val="0"/>
+                <w:i w:val="0"/>
+                <w:color w:val="1F2937"/>
+                <w:sz w:val="21"/>
+              </w:rPr>
+              <w:t>(B) Tie-up</w:t>
+            </w:r>
+          </w:p>
+        </w:tc>
+      </w:tr>
+    </w:tbl>
+    <w:tbl>
+      <w:tblPr>
+        <w:tblW w:type="auto" w:w="0"/>
+        <w:tblLook w:firstColumn="1" w:firstRow="1" w:lastColumn="0" w:lastRow="0" w:noHBand="0" w:noVBand="1" w:val="04A0"/>
+      </w:tblPr>
+      <w:tblGrid>
+        <w:gridCol w:w="9638"/>
+      </w:tblGrid>
+      <w:tr>
+        <w:tc>
+          <w:tcPr>
+            <w:tcW w:type="dxa" w:w="9638"/>
+            <w:tcBorders>
+              <w:top w:val="single" w:sz="4" w:color="BFBFBF"/>
+              <w:left w:val="single" w:sz="4" w:color="BFBFBF"/>
+              <w:bottom w:val="single" w:sz="4" w:color="BFBFBF"/>
+              <w:right w:val="single" w:sz="4" w:color="BFBFBF"/>
+            </w:tcBorders>
+          </w:tcPr>
+          <w:p>
+            <w:pPr>
+              <w:spacing w:after="40"/>
+              <w:ind w:left="340"/>
+            </w:pPr>
+            <w:r>
+              <w:rPr>
+                <w:rFonts w:ascii="Segoe UI" w:hAnsi="Segoe UI" w:eastAsia="Microsoft JhengHei"/>
+                <w:b/>
+                <w:i w:val="0"/>
+                <w:color w:val="1F2937"/>
+                <w:sz w:val="21"/>
+              </w:rPr>
+              <w:t xml:space="preserve">Number of arrangements: </w:t>
+            </w:r>
+            <w:r>
+              <w:rPr>
+                <w:rFonts w:ascii="Segoe UI" w:hAnsi="Segoe UI" w:eastAsia="Microsoft JhengHei"/>
+                <w:b w:val="0"/>
+                <w:i w:val="0"/>
+                <w:color w:val="6B7280"/>
+                <w:sz w:val="21"/>
+              </w:rPr>
+              <w:t>____________________________</w:t>
+            </w:r>
+          </w:p>
+        </w:tc>
+      </w:tr>
+    </w:tbl>
+    <w:p>
+      <w:pPr>
+        <w:keepNext w:val="0"/>
+        <w:spacing w:after="0" w:before="0" w:line="300" w:lineRule="auto"/>
+      </w:pPr>
+    </w:p>
+    <w:p>
+      <w:pPr>
+        <w:keepNext/>
+        <w:spacing w:after="20" w:before="120" w:line="300" w:lineRule="auto"/>
+      </w:pPr>
+      <w:r>
+        <w:rPr>
+          <w:rFonts w:ascii="Segoe UI" w:hAnsi="Segoe UI" w:eastAsia="Microsoft JhengHei"/>
+          <w:b/>
+          <w:i w:val="0"/>
+          <w:color w:val="1F2937"/>
+          <w:sz w:val="22"/>
+        </w:rPr>
+        <w:t xml:space="preserve">Q5 </w:t>
+      </w:r>
+      <w:r>
+        <w:rPr>
+          <w:rFonts w:ascii="Segoe UI" w:hAnsi="Segoe UI" w:eastAsia="Microsoft JhengHei"/>
+          <w:b w:val="0"/>
+          <w:i w:val="0"/>
+          <w:color w:val="6B7280"/>
+          <w:sz w:val="19"/>
+        </w:rPr>
+        <w:t>[1 mark]</w:t>
+      </w:r>
+    </w:p>
+    <w:p>
+      <w:pPr>
+        <w:keepNext/>
+        <w:spacing w:after="40" w:before="0" w:line="300" w:lineRule="auto"/>
+        <w:ind w:left="340"/>
+      </w:pPr>
+      <w:r>
+        <w:rPr>
+          <w:rFonts w:ascii="Segoe UI" w:hAnsi="Segoe UI" w:eastAsia="Microsoft JhengHei"/>
+          <w:b w:val="0"/>
+          <w:i w:val="0"/>
+          <w:color w:val="1F2937"/>
+          <w:sz w:val="21"/>
+        </w:rPr>
+        <w:t>A bag contains 5 red marbles and 4 blue marbles. 3 marbles are drawn from the bag. In the table below, tick every combination of red and blue marbles that satisfies ‘at least 1 red marble’.</w:t>
+      </w:r>
+    </w:p>
+    <w:tbl>
+      <w:tblPr>
+        <w:tblW w:type="auto" w:w="0"/>
+        <w:jc w:val="left"/>
+        <w:tblLook w:firstColumn="1" w:firstRow="1" w:lastColumn="0" w:lastRow="0" w:noHBand="0" w:noVBand="1" w:val="04A0"/>
+      </w:tblPr>
+      <w:tblGrid>
+        <w:gridCol w:w="2409"/>
+        <w:gridCol w:w="2409"/>
+        <w:gridCol w:w="2409"/>
+        <w:gridCol w:w="2409"/>
+      </w:tblGrid>
+      <w:tr>
+        <w:trPr>
+          <w:cantSplit/>
+        </w:trPr>
+        <w:tc>
+          <w:tcPr>
+            <w:tcW w:type="dxa" w:w="2409"/>
+            <w:tcBorders>
+              <w:top w:val="single" w:sz="4" w:color="BFBFBF"/>
+              <w:left w:val="single" w:sz="4" w:color="BFBFBF"/>
+              <w:bottom w:val="single" w:sz="4" w:color="BFBFBF"/>
+              <w:right w:val="single" w:sz="4" w:color="BFBFBF"/>
+            </w:tcBorders>
+          </w:tcPr>
+          <w:p>
+            <w:pPr>
+              <w:keepNext/>
+              <w:spacing w:after="20"/>
+              <w:jc w:val="center"/>
+            </w:pPr>
+            <w:r>
+              <w:rPr>
+                <w:rFonts w:ascii="Segoe UI" w:hAnsi="Segoe UI" w:eastAsia="Microsoft JhengHei"/>
+                <w:b/>
+                <w:i w:val="0"/>
+                <w:color w:val="1F2937"/>
+                <w:sz w:val="21"/>
+              </w:rPr>
+            </w:r>
+          </w:p>
+        </w:tc>
+        <w:tc>
+          <w:tcPr>
+            <w:tcW w:type="dxa" w:w="2409"/>
+            <w:tcBorders>
+              <w:top w:val="single" w:sz="4" w:color="BFBFBF"/>
+              <w:left w:val="single" w:sz="4" w:color="BFBFBF"/>
+              <w:bottom w:val="single" w:sz="4" w:color="BFBFBF"/>
+              <w:right w:val="single" w:sz="4" w:color="BFBFBF"/>
+            </w:tcBorders>
+          </w:tcPr>
+          <w:p>
+            <w:pPr>
+              <w:keepNext/>
+              <w:spacing w:after="20"/>
+              <w:jc w:val="center"/>
+            </w:pPr>
+            <w:r>
+              <w:rPr>
+                <w:rFonts w:ascii="Segoe UI" w:hAnsi="Segoe UI" w:eastAsia="Microsoft JhengHei"/>
+                <w:b/>
+                <w:i w:val="0"/>
+                <w:color w:val="1F2937"/>
+                <w:sz w:val="21"/>
+              </w:rPr>
+              <w:t>Red</w:t>
+            </w:r>
+          </w:p>
+        </w:tc>
+        <w:tc>
+          <w:tcPr>
+            <w:tcW w:type="dxa" w:w="2409"/>
+            <w:tcBorders>
+              <w:top w:val="single" w:sz="4" w:color="BFBFBF"/>
+              <w:left w:val="single" w:sz="4" w:color="BFBFBF"/>
+              <w:bottom w:val="single" w:sz="4" w:color="BFBFBF"/>
+              <w:right w:val="single" w:sz="4" w:color="BFBFBF"/>
+            </w:tcBorders>
+          </w:tcPr>
+          <w:p>
+            <w:pPr>
+              <w:keepNext/>
+              <w:spacing w:after="20"/>
+              <w:jc w:val="center"/>
+            </w:pPr>
+            <w:r>
+              <w:rPr>
+                <w:rFonts w:ascii="Segoe UI" w:hAnsi="Segoe UI" w:eastAsia="Microsoft JhengHei"/>
+                <w:b/>
+                <w:i w:val="0"/>
+                <w:color w:val="1F2937"/>
+                <w:sz w:val="21"/>
+              </w:rPr>
+              <w:t>Blue</w:t>
+            </w:r>
+          </w:p>
+        </w:tc>
+        <w:tc>
+          <w:tcPr>
+            <w:tcW w:type="dxa" w:w="2409"/>
+            <w:tcBorders>
+              <w:top w:val="single" w:sz="4" w:color="BFBFBF"/>
+              <w:left w:val="single" w:sz="4" w:color="BFBFBF"/>
+              <w:bottom w:val="single" w:sz="4" w:color="BFBFBF"/>
+              <w:right w:val="single" w:sz="4" w:color="BFBFBF"/>
+            </w:tcBorders>
+          </w:tcPr>
+          <w:p>
+            <w:pPr>
+              <w:keepNext/>
+              <w:spacing w:after="20"/>
+              <w:jc w:val="center"/>
+            </w:pPr>
+            <w:r>
+              <w:rPr>
+                <w:rFonts w:ascii="Segoe UI" w:hAnsi="Segoe UI" w:eastAsia="Microsoft JhengHei"/>
+                <w:b/>
+                <w:i w:val="0"/>
+                <w:color w:val="1F2937"/>
+                <w:sz w:val="21"/>
+              </w:rPr>
+              <w:t>Tick</w:t>
+            </w:r>
+          </w:p>
+        </w:tc>
+      </w:tr>
+      <w:tr>
+        <w:trPr>
+          <w:trHeight w:val="397"/>
+          <w:cantSplit/>
+        </w:trPr>
+        <w:tc>
+          <w:tcPr>
+            <w:tcW w:type="dxa" w:w="2409"/>
+            <w:tcBorders>
+              <w:top w:val="single" w:sz="4" w:color="BFBFBF"/>
+              <w:left w:val="single" w:sz="4" w:color="BFBFBF"/>
+              <w:bottom w:val="single" w:sz="4" w:color="BFBFBF"/>
+              <w:right w:val="single" w:sz="4" w:color="BFBFBF"/>
+            </w:tcBorders>
+          </w:tcPr>
+          <w:p>
+            <w:pPr>
+              <w:keepNext/>
+              <w:spacing w:after="20"/>
+              <w:jc w:val="center"/>
+            </w:pPr>
+            <w:r>
+              <w:rPr>
+                <w:rFonts w:ascii="Segoe UI" w:hAnsi="Segoe UI" w:eastAsia="Microsoft JhengHei"/>
+                <w:b/>
+                <w:i w:val="0"/>
+                <w:color w:val="1F2937"/>
+                <w:sz w:val="21"/>
+              </w:rPr>
+              <w:t>(A)</w:t>
+            </w:r>
+          </w:p>
+        </w:tc>
+        <w:tc>
+          <w:tcPr>
+            <w:tcW w:type="dxa" w:w="2409"/>
+            <w:tcBorders>
+              <w:top w:val="single" w:sz="4" w:color="BFBFBF"/>
+              <w:left w:val="single" w:sz="4" w:color="BFBFBF"/>
+              <w:bottom w:val="single" w:sz="4" w:color="BFBFBF"/>
+              <w:right w:val="single" w:sz="4" w:color="BFBFBF"/>
+            </w:tcBorders>
+          </w:tcPr>
+          <w:p>
+            <w:pPr>
+              <w:keepNext/>
+              <w:spacing w:after="20"/>
+              <w:jc w:val="center"/>
+            </w:pPr>
+            <w:r>
+              <w:rPr>
+                <w:rFonts w:ascii="Segoe UI" w:hAnsi="Segoe UI" w:eastAsia="Microsoft JhengHei"/>
+                <w:b w:val="0"/>
+                <w:i w:val="0"/>
+                <w:color w:val="1F2937"/>
+                <w:sz w:val="21"/>
+              </w:rPr>
+              <w:t>3</w:t>
+            </w:r>
+          </w:p>
+        </w:tc>
+        <w:tc>
+          <w:tcPr>
+            <w:tcW w:type="dxa" w:w="2409"/>
+            <w:tcBorders>
+              <w:top w:val="single" w:sz="4" w:color="BFBFBF"/>
+              <w:left w:val="single" w:sz="4" w:color="BFBFBF"/>
+              <w:bottom w:val="single" w:sz="4" w:color="BFBFBF"/>
+              <w:right w:val="single" w:sz="4" w:color="BFBFBF"/>
+            </w:tcBorders>
+          </w:tcPr>
+          <w:p>
+            <w:pPr>
+              <w:keepNext/>
+              <w:spacing w:after="20"/>
+              <w:jc w:val="center"/>
+            </w:pPr>
+            <w:r>
+              <w:rPr>
+                <w:rFonts w:ascii="Segoe UI" w:hAnsi="Segoe UI" w:eastAsia="Microsoft JhengHei"/>
+                <w:b w:val="0"/>
+                <w:i w:val="0"/>
+                <w:color w:val="1F2937"/>
+                <w:sz w:val="21"/>
+              </w:rPr>
+              <w:t>0</w:t>
+            </w:r>
+          </w:p>
+        </w:tc>
+        <w:tc>
+          <w:tcPr>
+            <w:tcW w:type="dxa" w:w="2409"/>
+          </w:tcPr>
+          <w:p>
+            <w:pPr>
+              <w:keepNext/>
+              <w:spacing w:after="0"/>
+              <w:jc w:val="center"/>
+            </w:pPr>
+            <w:r>
+              <w:rPr>
+                <w:rFonts w:ascii="Segoe UI" w:hAnsi="Segoe UI" w:eastAsia="Microsoft JhengHei"/>
+                <w:b w:val="0"/>
+                <w:i w:val="0"/>
+                <w:color w:val="6B7280"/>
+                <w:sz w:val="22"/>
+              </w:rPr>
+              <w:t>☐</w:t>
+            </w:r>
+          </w:p>
+        </w:tc>
+      </w:tr>
+      <w:tr>
+        <w:trPr>
+          <w:trHeight w:val="397"/>
+          <w:cantSplit/>
+        </w:trPr>
+        <w:tc>
+          <w:tcPr>
+            <w:tcW w:type="dxa" w:w="2409"/>
+            <w:tcBorders>
+              <w:top w:val="single" w:sz="4" w:color="BFBFBF"/>
+              <w:left w:val="single" w:sz="4" w:color="BFBFBF"/>
+              <w:bottom w:val="single" w:sz="4" w:color="BFBFBF"/>
+              <w:right w:val="single" w:sz="4" w:color="BFBFBF"/>
+            </w:tcBorders>
+          </w:tcPr>
+          <w:p>
+            <w:pPr>
+              <w:keepNext/>
+              <w:spacing w:after="20"/>
+              <w:jc w:val="center"/>
+            </w:pPr>
+            <w:r>
+              <w:rPr>
+                <w:rFonts w:ascii="Segoe UI" w:hAnsi="Segoe UI" w:eastAsia="Microsoft JhengHei"/>
+                <w:b/>
+                <w:i w:val="0"/>
+                <w:color w:val="1F2937"/>
+                <w:sz w:val="21"/>
+              </w:rPr>
+              <w:t>(B)</w:t>
+            </w:r>
+          </w:p>
+        </w:tc>
+        <w:tc>
+          <w:tcPr>
+            <w:tcW w:type="dxa" w:w="2409"/>
+            <w:tcBorders>
+              <w:top w:val="single" w:sz="4" w:color="BFBFBF"/>
+              <w:left w:val="single" w:sz="4" w:color="BFBFBF"/>
+              <w:bottom w:val="single" w:sz="4" w:color="BFBFBF"/>
+              <w:right w:val="single" w:sz="4" w:color="BFBFBF"/>
+            </w:tcBorders>
+          </w:tcPr>
+          <w:p>
+            <w:pPr>
+              <w:keepNext/>
+              <w:spacing w:after="20"/>
+              <w:jc w:val="center"/>
+            </w:pPr>
+            <w:r>
+              <w:rPr>
+                <w:rFonts w:ascii="Segoe UI" w:hAnsi="Segoe UI" w:eastAsia="Microsoft JhengHei"/>
+                <w:b w:val="0"/>
+                <w:i w:val="0"/>
+                <w:color w:val="1F2937"/>
+                <w:sz w:val="21"/>
+              </w:rPr>
+              <w:t>2</w:t>
+            </w:r>
+          </w:p>
+        </w:tc>
+        <w:tc>
+          <w:tcPr>
+            <w:tcW w:type="dxa" w:w="2409"/>
+            <w:tcBorders>
+              <w:top w:val="single" w:sz="4" w:color="BFBFBF"/>
+              <w:left w:val="single" w:sz="4" w:color="BFBFBF"/>
+              <w:bottom w:val="single" w:sz="4" w:color="BFBFBF"/>
+              <w:right w:val="single" w:sz="4" w:color="BFBFBF"/>
+            </w:tcBorders>
+          </w:tcPr>
+          <w:p>
+            <w:pPr>
+              <w:keepNext/>
+              <w:spacing w:after="20"/>
+              <w:jc w:val="center"/>
+            </w:pPr>
+            <w:r>
+              <w:rPr>
+                <w:rFonts w:ascii="Segoe UI" w:hAnsi="Segoe UI" w:eastAsia="Microsoft JhengHei"/>
+                <w:b w:val="0"/>
+                <w:i w:val="0"/>
+                <w:color w:val="1F2937"/>
+                <w:sz w:val="21"/>
+              </w:rPr>
+              <w:t>1</w:t>
+            </w:r>
+          </w:p>
+        </w:tc>
+        <w:tc>
+          <w:tcPr>
+            <w:tcW w:type="dxa" w:w="2409"/>
+          </w:tcPr>
+          <w:p>
+            <w:pPr>
+              <w:keepNext/>
+              <w:spacing w:after="0"/>
+              <w:jc w:val="center"/>
+            </w:pPr>
+            <w:r>
+              <w:rPr>
+                <w:rFonts w:ascii="Segoe UI" w:hAnsi="Segoe UI" w:eastAsia="Microsoft JhengHei"/>
+                <w:b w:val="0"/>
+                <w:i w:val="0"/>
+                <w:color w:val="6B7280"/>
+                <w:sz w:val="22"/>
+              </w:rPr>
+              <w:t>☐</w:t>
+            </w:r>
+          </w:p>
+        </w:tc>
+      </w:tr>
+      <w:tr>
+        <w:trPr>
+          <w:trHeight w:val="397"/>
+          <w:cantSplit/>
+        </w:trPr>
+        <w:tc>
+          <w:tcPr>
+            <w:tcW w:type="dxa" w:w="2409"/>
+            <w:tcBorders>
+              <w:top w:val="single" w:sz="4" w:color="BFBFBF"/>
+              <w:left w:val="single" w:sz="4" w:color="BFBFBF"/>
+              <w:bottom w:val="single" w:sz="4" w:color="BFBFBF"/>
+              <w:right w:val="single" w:sz="4" w:color="BFBFBF"/>
+            </w:tcBorders>
+          </w:tcPr>
+          <w:p>
+            <w:pPr>
+              <w:keepNext/>
+              <w:spacing w:after="20"/>
+              <w:jc w:val="center"/>
+            </w:pPr>
+            <w:r>
+              <w:rPr>
+                <w:rFonts w:ascii="Segoe UI" w:hAnsi="Segoe UI" w:eastAsia="Microsoft JhengHei"/>
+                <w:b/>
+                <w:i w:val="0"/>
+                <w:color w:val="1F2937"/>
+                <w:sz w:val="21"/>
+              </w:rPr>
+              <w:t>(C)</w:t>
+            </w:r>
+          </w:p>
+        </w:tc>
+        <w:tc>
+          <w:tcPr>
+            <w:tcW w:type="dxa" w:w="2409"/>
+            <w:tcBorders>
+              <w:top w:val="single" w:sz="4" w:color="BFBFBF"/>
+              <w:left w:val="single" w:sz="4" w:color="BFBFBF"/>
+              <w:bottom w:val="single" w:sz="4" w:color="BFBFBF"/>
+              <w:right w:val="single" w:sz="4" w:color="BFBFBF"/>
+            </w:tcBorders>
+          </w:tcPr>
+          <w:p>
+            <w:pPr>
+              <w:keepNext/>
+              <w:spacing w:after="20"/>
+              <w:jc w:val="center"/>
+            </w:pPr>
+            <w:r>
+              <w:rPr>
+                <w:rFonts w:ascii="Segoe UI" w:hAnsi="Segoe UI" w:eastAsia="Microsoft JhengHei"/>
+                <w:b w:val="0"/>
+                <w:i w:val="0"/>
+                <w:color w:val="1F2937"/>
+                <w:sz w:val="21"/>
+              </w:rPr>
+              <w:t>1</w:t>
+            </w:r>
+          </w:p>
+        </w:tc>
+        <w:tc>
+          <w:tcPr>
+            <w:tcW w:type="dxa" w:w="2409"/>
+            <w:tcBorders>
+              <w:top w:val="single" w:sz="4" w:color="BFBFBF"/>
+              <w:left w:val="single" w:sz="4" w:color="BFBFBF"/>
+              <w:bottom w:val="single" w:sz="4" w:color="BFBFBF"/>
+              <w:right w:val="single" w:sz="4" w:color="BFBFBF"/>
+            </w:tcBorders>
+          </w:tcPr>
+          <w:p>
+            <w:pPr>
+              <w:keepNext/>
+              <w:spacing w:after="20"/>
+              <w:jc w:val="center"/>
+            </w:pPr>
+            <w:r>
+              <w:rPr>
+                <w:rFonts w:ascii="Segoe UI" w:hAnsi="Segoe UI" w:eastAsia="Microsoft JhengHei"/>
+                <w:b w:val="0"/>
+                <w:i w:val="0"/>
+                <w:color w:val="1F2937"/>
+                <w:sz w:val="21"/>
+              </w:rPr>
+              <w:t>2</w:t>
+            </w:r>
+          </w:p>
+        </w:tc>
+        <w:tc>
+          <w:tcPr>
+            <w:tcW w:type="dxa" w:w="2409"/>
+          </w:tcPr>
+          <w:p>
+            <w:pPr>
+              <w:keepNext/>
+              <w:spacing w:after="0"/>
+              <w:jc w:val="center"/>
+            </w:pPr>
+            <w:r>
+              <w:rPr>
+                <w:rFonts w:ascii="Segoe UI" w:hAnsi="Segoe UI" w:eastAsia="Microsoft JhengHei"/>
+                <w:b w:val="0"/>
+                <w:i w:val="0"/>
+                <w:color w:val="6B7280"/>
+                <w:sz w:val="22"/>
+              </w:rPr>
+              <w:t>☐</w:t>
+            </w:r>
+          </w:p>
+        </w:tc>
+      </w:tr>
+      <w:tr>
+        <w:trPr>
+          <w:trHeight w:val="397"/>
+          <w:cantSplit/>
+        </w:trPr>
+        <w:tc>
+          <w:tcPr>
+            <w:tcW w:type="dxa" w:w="2409"/>
+            <w:tcBorders>
+              <w:top w:val="single" w:sz="4" w:color="BFBFBF"/>
+              <w:left w:val="single" w:sz="4" w:color="BFBFBF"/>
+              <w:bottom w:val="single" w:sz="4" w:color="BFBFBF"/>
+              <w:right w:val="single" w:sz="4" w:color="BFBFBF"/>
+            </w:tcBorders>
+          </w:tcPr>
+          <w:p>
+            <w:pPr>
+              <w:keepNext w:val="0"/>
+              <w:spacing w:after="20"/>
+              <w:jc w:val="center"/>
+            </w:pPr>
+            <w:r>
+              <w:rPr>
+                <w:rFonts w:ascii="Segoe UI" w:hAnsi="Segoe UI" w:eastAsia="Microsoft JhengHei"/>
+                <w:b/>
+                <w:i w:val="0"/>
+                <w:color w:val="1F2937"/>
+                <w:sz w:val="21"/>
+              </w:rPr>
+              <w:t>(D)</w:t>
+            </w:r>
+          </w:p>
+        </w:tc>
+        <w:tc>
+          <w:tcPr>
+            <w:tcW w:type="dxa" w:w="2409"/>
+            <w:tcBorders>
+              <w:top w:val="single" w:sz="4" w:color="BFBFBF"/>
+              <w:left w:val="single" w:sz="4" w:color="BFBFBF"/>
+              <w:bottom w:val="single" w:sz="4" w:color="BFBFBF"/>
+              <w:right w:val="single" w:sz="4" w:color="BFBFBF"/>
+            </w:tcBorders>
+          </w:tcPr>
+          <w:p>
+            <w:pPr>
+              <w:keepNext w:val="0"/>
+              <w:spacing w:after="20"/>
+              <w:jc w:val="center"/>
+            </w:pPr>
+            <w:r>
+              <w:rPr>
+                <w:rFonts w:ascii="Segoe UI" w:hAnsi="Segoe UI" w:eastAsia="Microsoft JhengHei"/>
+                <w:b w:val="0"/>
+                <w:i w:val="0"/>
+                <w:color w:val="1F2937"/>
+                <w:sz w:val="21"/>
+              </w:rPr>
+              <w:t>0</w:t>
+            </w:r>
+          </w:p>
+        </w:tc>
+        <w:tc>
+          <w:tcPr>
+            <w:tcW w:type="dxa" w:w="2409"/>
+            <w:tcBorders>
+              <w:top w:val="single" w:sz="4" w:color="BFBFBF"/>
+              <w:left w:val="single" w:sz="4" w:color="BFBFBF"/>
+              <w:bottom w:val="single" w:sz="4" w:color="BFBFBF"/>
+              <w:right w:val="single" w:sz="4" w:color="BFBFBF"/>
+            </w:tcBorders>
+          </w:tcPr>
+          <w:p>
+            <w:pPr>
+              <w:keepNext w:val="0"/>
+              <w:spacing w:after="20"/>
+              <w:jc w:val="center"/>
+            </w:pPr>
+            <w:r>
+              <w:rPr>
+                <w:rFonts w:ascii="Segoe UI" w:hAnsi="Segoe UI" w:eastAsia="Microsoft JhengHei"/>
+                <w:b w:val="0"/>
+                <w:i w:val="0"/>
+                <w:color w:val="1F2937"/>
+                <w:sz w:val="21"/>
+              </w:rPr>
+              <w:t>3</w:t>
+            </w:r>
+          </w:p>
+        </w:tc>
+        <w:tc>
+          <w:tcPr>
+            <w:tcW w:type="dxa" w:w="2409"/>
+          </w:tcPr>
+          <w:p>
+            <w:pPr>
+              <w:keepNext w:val="0"/>
+              <w:spacing w:after="0"/>
+              <w:jc w:val="center"/>
+            </w:pPr>
+            <w:r>
+              <w:rPr>
+                <w:rFonts w:ascii="Segoe UI" w:hAnsi="Segoe UI" w:eastAsia="Microsoft JhengHei"/>
+                <w:b w:val="0"/>
+                <w:i w:val="0"/>
+                <w:color w:val="6B7280"/>
+                <w:sz w:val="22"/>
+              </w:rPr>
+              <w:t>☐</w:t>
             </w:r>
           </w:p>
         </w:tc>

</xml_diff>

<commit_message>
Make the part overview readable: one-line summary plus numbered introSteps
The overview card used to print the whole intro as one wall of text (up to 684 characters). Every part now keeps a short bilingual intro and moves the detail into introSteps[2-5], rendered as a numbered list reusing the home page's how-to styling (.how-paper), and the Word worksheet prints the same steps in English. build.py gains rule S16 (check_intro): intros longer than 200 characters without introSteps are a warning, introSteps must be a non-empty list of at most 8 items with real Chinese and English text.
</commit_message>
<xml_diff>
--- a/docs/worksheets/ch17-test-worksheet.docx
+++ b/docs/worksheets/ch17-test-worksheet.docx
@@ -88,6 +88,198 @@
         </w:rPr>
         <w:t>15 questions, 35 marks in all.</w:t>
       </w:r>
+    </w:p>
+    <w:p>
+      <w:pPr>
+        <w:keepNext/>
+        <w:spacing w:after="40" w:before="40" w:line="300" w:lineRule="auto"/>
+      </w:pPr>
+      <w:r>
+        <w:rPr>
+          <w:rFonts w:ascii="Segoe UI" w:hAnsi="Segoe UI" w:eastAsia="Microsoft JhengHei"/>
+          <w:b/>
+          <w:i w:val="0"/>
+          <w:color w:val="1F2937"/>
+          <w:sz w:val="21"/>
+        </w:rPr>
+        <w:t>How to work through this paper</w:t>
+      </w:r>
+    </w:p>
+    <w:p>
+      <w:pPr>
+        <w:keepNext/>
+        <w:spacing w:after="20" w:before="0" w:line="300" w:lineRule="auto"/>
+        <w:ind w:left="227"/>
+      </w:pPr>
+      <w:r>
+        <w:rPr>
+          <w:rFonts w:ascii="Segoe UI" w:hAnsi="Segoe UI" w:eastAsia="Microsoft JhengHei"/>
+          <w:b/>
+          <w:i w:val="0"/>
+          <w:color w:val="1F2937"/>
+          <w:sz w:val="19"/>
+        </w:rPr>
+        <w:t>1. Start with the 5-question quick check (5 marks)</w:t>
+      </w:r>
+    </w:p>
+    <w:p>
+      <w:pPr>
+        <w:keepNext/>
+        <w:spacing w:after="20" w:before="0" w:line="300" w:lineRule="auto"/>
+        <w:ind w:left="510"/>
+      </w:pPr>
+      <w:r>
+        <w:rPr>
+          <w:rFonts w:ascii="Segoe UI" w:hAnsi="Segoe UI" w:eastAsia="Microsoft JhengHei"/>
+          <w:b w:val="0"/>
+          <w:i w:val="0"/>
+          <w:color w:val="6B7280"/>
+          <w:sz w:val="19"/>
+        </w:rPr>
+        <w:t>· Q1 and Q2: choose an option and you know straight away whether it is right.</w:t>
+      </w:r>
+    </w:p>
+    <w:p>
+      <w:pPr>
+        <w:keepNext/>
+        <w:spacing w:after="20" w:before="0" w:line="300" w:lineRule="auto"/>
+        <w:ind w:left="510"/>
+      </w:pPr>
+      <w:r>
+        <w:rPr>
+          <w:rFonts w:ascii="Segoe UI" w:hAnsi="Segoe UI" w:eastAsia="Microsoft JhengHei"/>
+          <w:b w:val="0"/>
+          <w:i w:val="0"/>
+          <w:color w:val="6B7280"/>
+          <w:sz w:val="19"/>
+        </w:rPr>
+        <w:t>· Q3 and Q4: choose the method (slot-in or tie-up), type the number of arrangements in the box, then press Submit.</w:t>
+      </w:r>
+    </w:p>
+    <w:p>
+      <w:pPr>
+        <w:keepNext/>
+        <w:spacing w:after="20" w:before="0" w:line="300" w:lineRule="auto"/>
+        <w:ind w:left="510"/>
+      </w:pPr>
+      <w:r>
+        <w:rPr>
+          <w:rFonts w:ascii="Segoe UI" w:hAnsi="Segoe UI" w:eastAsia="Microsoft JhengHei"/>
+          <w:b w:val="0"/>
+          <w:i w:val="0"/>
+          <w:color w:val="6B7280"/>
+          <w:sz w:val="19"/>
+        </w:rPr>
+        <w:t>· Q5: tick every red/blue combination in the table that satisfies 'at least 1 red marble', then press Submit.</w:t>
+      </w:r>
+    </w:p>
+    <w:p>
+      <w:pPr>
+        <w:keepNext/>
+        <w:spacing w:after="20" w:before="0" w:line="300" w:lineRule="auto"/>
+        <w:ind w:left="227"/>
+      </w:pPr>
+      <w:r>
+        <w:rPr>
+          <w:rFonts w:ascii="Segoe UI" w:hAnsi="Segoe UI" w:eastAsia="Microsoft JhengHei"/>
+          <w:b/>
+          <w:i w:val="0"/>
+          <w:color w:val="1F2937"/>
+          <w:sz w:val="19"/>
+        </w:rPr>
+        <w:t>2. When the quick check is done, work on the rest on your own</w:t>
+      </w:r>
+    </w:p>
+    <w:p>
+      <w:pPr>
+        <w:keepNext/>
+        <w:spacing w:after="20" w:before="0" w:line="300" w:lineRule="auto"/>
+        <w:ind w:left="510"/>
+      </w:pPr>
+      <w:r>
+        <w:rPr>
+          <w:rFonts w:ascii="Segoe UI" w:hAnsi="Segoe UI" w:eastAsia="Microsoft JhengHei"/>
+          <w:b w:val="0"/>
+          <w:i w:val="0"/>
+          <w:color w:val="6B7280"/>
+          <w:sz w:val="19"/>
+        </w:rPr>
+        <w:t>Section A: 4 multiple-choice questions (2 marks each, 8 marks). Section B: 6 conventional questions (22 marks), each split into (a), (b) parts - write your working before you check.</w:t>
+      </w:r>
+    </w:p>
+    <w:p>
+      <w:pPr>
+        <w:keepNext/>
+        <w:spacing w:after="20" w:before="0" w:line="300" w:lineRule="auto"/>
+        <w:ind w:left="227"/>
+      </w:pPr>
+      <w:r>
+        <w:rPr>
+          <w:rFonts w:ascii="Segoe UI" w:hAnsi="Segoe UI" w:eastAsia="Microsoft JhengHei"/>
+          <w:b/>
+          <w:i w:val="0"/>
+          <w:color w:val="1F2937"/>
+          <w:sz w:val="19"/>
+        </w:rPr>
+        <w:t>3. Section B is adapted from the EPH Level 5 Assurance Pack WS22 worksheet (22.1 Permutation and Combination) and checked against its official solutions</w:t>
+      </w:r>
+    </w:p>
+    <w:p>
+      <w:pPr>
+        <w:keepNext/>
+        <w:spacing w:after="20" w:before="0" w:line="300" w:lineRule="auto"/>
+        <w:ind w:left="510"/>
+      </w:pPr>
+      <w:r>
+        <w:rPr>
+          <w:rFonts w:ascii="Segoe UI" w:hAnsi="Segoe UI" w:eastAsia="Microsoft JhengHei"/>
+          <w:b w:val="0"/>
+          <w:i w:val="0"/>
+          <w:color w:val="6B7280"/>
+          <w:sz w:val="19"/>
+        </w:rPr>
+        <w:t>It covers: add for cases and multiply for steps, avoiding double counting, n! and P(n,r), adjacent, alternating and position restrictions, C(n,r), at least / at most, case splitting and the complement.</w:t>
+      </w:r>
+    </w:p>
+    <w:p>
+      <w:pPr>
+        <w:keepNext/>
+        <w:spacing w:after="20" w:before="0" w:line="300" w:lineRule="auto"/>
+        <w:ind w:left="227"/>
+      </w:pPr>
+      <w:r>
+        <w:rPr>
+          <w:rFonts w:ascii="Segoe UI" w:hAnsi="Segoe UI" w:eastAsia="Microsoft JhengHei"/>
+          <w:b/>
+          <w:i w:val="0"/>
+          <w:color w:val="1F2937"/>
+          <w:sz w:val="19"/>
+        </w:rPr>
+        <w:t>4. Try the whole paper against the clock first, then read the solutions question by question</w:t>
+      </w:r>
+    </w:p>
+    <w:p>
+      <w:pPr>
+        <w:keepNext/>
+        <w:spacing w:after="20" w:before="0" w:line="300" w:lineRule="auto"/>
+        <w:ind w:left="510"/>
+      </w:pPr>
+      <w:r>
+        <w:rPr>
+          <w:rFonts w:ascii="Segoe UI" w:hAnsi="Segoe UI" w:eastAsia="Microsoft JhengHei"/>
+          <w:b w:val="0"/>
+          <w:i w:val="0"/>
+          <w:color w:val="6B7280"/>
+          <w:sz w:val="19"/>
+        </w:rPr>
+        <w:t>Every question has step-by-step worked solutions, the traps that catch people out, and a take-away tip.</w:t>
+      </w:r>
+    </w:p>
+    <w:p>
+      <w:pPr>
+        <w:keepNext w:val="0"/>
+        <w:spacing w:after="0" w:before="0" w:line="300" w:lineRule="auto"/>
+      </w:pPr>
     </w:p>
     <w:p>
       <w:pPr>

</xml_diff>